<commit_message>
Update DOCX formatting with improved code block styling
</commit_message>
<xml_diff>
--- a/CS1101_Programming_Fundamentals/Unit3_Conditionals_Recursion/Assignment/Unit3_Programming_Assignment.docx
+++ b/CS1101_Programming_Fundamentals/Unit3_Conditionals_Recursion/Assignment/Unit3_Programming_Assignment.docx
@@ -195,54 +195,55 @@
     <w:p>
       <w:pPr>
         <w:pStyle w:val="BodyText"/>
-        <w:spacing w:line="480" w:lineRule="auto"/>
-      </w:pPr>
-      <w:r>
-        <w:rPr>
-          <w:rFonts w:ascii="Times New Roman" w:hAnsi="Times New Roman"/>
-          <w:sz w:val="24"/>
+        <w:spacing w:line="240" w:lineRule="auto"/>
+        <w:ind w:left="720"/>
+      </w:pPr>
+      <w:r>
+        <w:rPr>
+          <w:rFonts w:ascii="Consolas" w:hAnsi="Consolas"/>
+          <w:sz w:val="20"/>
         </w:rPr>
         <w:t xml:space="preserve">The main program uses conditional statements to determine which function to call based on user input. According to Downey (2015), conditional execution allows programs to make decisions by checking boolean expressions and executing different code paths accordingly (p. 43). For zero input, I chose to call the countdown function because zero represents the boundary between positive and negative numbers, and countdown naturally handles zero as its base case by immediately printing</w:t>
       </w:r>
       <w:r>
         <w:rPr>
-          <w:rFonts w:ascii="Times New Roman" w:hAnsi="Times New Roman"/>
-          <w:sz w:val="24"/>
+          <w:rFonts w:ascii="Consolas" w:hAnsi="Consolas"/>
+          <w:sz w:val="20"/>
         </w:rPr>
         <w:t xml:space="preserve"> </w:t>
       </w:r>
       <w:r>
         <w:rPr>
-          <w:rFonts w:ascii="Times New Roman" w:hAnsi="Times New Roman"/>
-          <w:sz w:val="24"/>
+          <w:rFonts w:ascii="Consolas" w:hAnsi="Consolas"/>
+          <w:sz w:val="20"/>
         </w:rPr>
         <w:t xml:space="preserve">“</w:t>
       </w:r>
       <w:r>
         <w:rPr>
-          <w:rFonts w:ascii="Times New Roman" w:hAnsi="Times New Roman"/>
-          <w:sz w:val="24"/>
+          <w:rFonts w:ascii="Consolas" w:hAnsi="Consolas"/>
+          <w:sz w:val="20"/>
         </w:rPr>
         <w:t xml:space="preserve">Blastoff!</w:t>
       </w:r>
       <w:r>
         <w:rPr>
-          <w:rFonts w:ascii="Times New Roman" w:hAnsi="Times New Roman"/>
-          <w:sz w:val="24"/>
+          <w:rFonts w:ascii="Consolas" w:hAnsi="Consolas"/>
+          <w:sz w:val="20"/>
         </w:rPr>
         <w:t xml:space="preserve">”</w:t>
       </w:r>
       <w:r>
         <w:rPr>
-          <w:rFonts w:ascii="Times New Roman" w:hAnsi="Times New Roman"/>
-          <w:sz w:val="24"/>
+          <w:rFonts w:ascii="Consolas" w:hAnsi="Consolas"/>
+          <w:sz w:val="20"/>
         </w:rPr>
         <w:t xml:space="preserve"> </w:t>
       </w:r>
       <w:r>
         <w:rPr>
-          <w:rFonts w:ascii="Times New Roman" w:hAnsi="Times New Roman"/>
-          <w:sz w:val="24"/>
+          <w:rFonts w:ascii="Consolas" w:hAnsi="Consolas"/>
+          <w:sz w:val="20"/>
         </w:rPr>
         <w:t xml:space="preserve">without recursion. This design choice maintains consistency with the original countdown function’s behavior and provides immediate feedback for the boundary condition.</w:t>
       </w:r>
@@ -265,13 +266,15 @@
     <w:p>
       <w:pPr>
         <w:pStyle w:val="SourceCode"/>
-        <w:spacing w:line="480" w:lineRule="auto"/>
+        <w:spacing w:line="240" w:lineRule="auto"/>
+        <w:ind w:left="720"/>
       </w:pPr>
       <w:r>
         <w:rPr>
           <w:rStyle w:val="KeywordTok"/>
           <w:rFonts w:ascii="Consolas" w:hAnsi="Consolas"/>
           <w:sz w:val="20"/>
+          <w:shd w:fill="F5F5F5"/>
         </w:rPr>
         <w:t xml:space="preserve">def</w:t>
       </w:r>
@@ -280,6 +283,7 @@
           <w:rStyle w:val="NormalTok"/>
           <w:rFonts w:ascii="Consolas" w:hAnsi="Consolas"/>
           <w:sz w:val="20"/>
+          <w:shd w:fill="F5F5F5"/>
         </w:rPr>
         <w:t xml:space="preserve"> countdown(n):</w:t>
       </w:r>
@@ -287,14 +291,16 @@
         <w:rPr>
           <w:rFonts w:ascii="Consolas" w:hAnsi="Consolas"/>
           <w:sz w:val="20"/>
-        </w:rPr>
-        <w:br/>
-      </w:r>
-      <w:r>
-        <w:rPr>
-          <w:rStyle w:val="NormalTok"/>
-          <w:rFonts w:ascii="Consolas" w:hAnsi="Consolas"/>
-          <w:sz w:val="20"/>
+          <w:shd w:fill="F5F5F5"/>
+        </w:rPr>
+        <w:br/>
+      </w:r>
+      <w:r>
+        <w:rPr>
+          <w:rStyle w:val="NormalTok"/>
+          <w:rFonts w:ascii="Consolas" w:hAnsi="Consolas"/>
+          <w:sz w:val="20"/>
+          <w:shd w:fill="F5F5F5"/>
         </w:rPr>
         <w:t xml:space="preserve">    </w:t>
       </w:r>
@@ -303,6 +309,7 @@
           <w:rStyle w:val="CommentTok"/>
           <w:rFonts w:ascii="Consolas" w:hAnsi="Consolas"/>
           <w:sz w:val="20"/>
+          <w:shd w:fill="F5F5F5"/>
         </w:rPr>
         <w:t xml:space="preserve">"""Recursive function that counts down from n to zero."""</w:t>
       </w:r>
@@ -310,14 +317,16 @@
         <w:rPr>
           <w:rFonts w:ascii="Consolas" w:hAnsi="Consolas"/>
           <w:sz w:val="20"/>
-        </w:rPr>
-        <w:br/>
-      </w:r>
-      <w:r>
-        <w:rPr>
-          <w:rStyle w:val="NormalTok"/>
-          <w:rFonts w:ascii="Consolas" w:hAnsi="Consolas"/>
-          <w:sz w:val="20"/>
+          <w:shd w:fill="F5F5F5"/>
+        </w:rPr>
+        <w:br/>
+      </w:r>
+      <w:r>
+        <w:rPr>
+          <w:rStyle w:val="NormalTok"/>
+          <w:rFonts w:ascii="Consolas" w:hAnsi="Consolas"/>
+          <w:sz w:val="20"/>
+          <w:shd w:fill="F5F5F5"/>
         </w:rPr>
         <w:t xml:space="preserve">    </w:t>
       </w:r>
@@ -326,6 +335,7 @@
           <w:rStyle w:val="ControlFlowTok"/>
           <w:rFonts w:ascii="Consolas" w:hAnsi="Consolas"/>
           <w:sz w:val="20"/>
+          <w:shd w:fill="F5F5F5"/>
         </w:rPr>
         <w:t xml:space="preserve">if</w:t>
       </w:r>
@@ -334,6 +344,7 @@
           <w:rStyle w:val="NormalTok"/>
           <w:rFonts w:ascii="Consolas" w:hAnsi="Consolas"/>
           <w:sz w:val="20"/>
+          <w:shd w:fill="F5F5F5"/>
         </w:rPr>
         <w:t xml:space="preserve"> n </w:t>
       </w:r>
@@ -342,6 +353,7 @@
           <w:rStyle w:val="OperatorTok"/>
           <w:rFonts w:ascii="Consolas" w:hAnsi="Consolas"/>
           <w:sz w:val="20"/>
+          <w:shd w:fill="F5F5F5"/>
         </w:rPr>
         <w:t xml:space="preserve">&lt;=</w:t>
       </w:r>
@@ -350,6 +362,7 @@
           <w:rStyle w:val="NormalTok"/>
           <w:rFonts w:ascii="Consolas" w:hAnsi="Consolas"/>
           <w:sz w:val="20"/>
+          <w:shd w:fill="F5F5F5"/>
         </w:rPr>
         <w:t xml:space="preserve"> </w:t>
       </w:r>
@@ -358,6 +371,7 @@
           <w:rStyle w:val="DecValTok"/>
           <w:rFonts w:ascii="Consolas" w:hAnsi="Consolas"/>
           <w:sz w:val="20"/>
+          <w:shd w:fill="F5F5F5"/>
         </w:rPr>
         <w:t xml:space="preserve">0</w:t>
       </w:r>
@@ -366,6 +380,7 @@
           <w:rStyle w:val="NormalTok"/>
           <w:rFonts w:ascii="Consolas" w:hAnsi="Consolas"/>
           <w:sz w:val="20"/>
+          <w:shd w:fill="F5F5F5"/>
         </w:rPr>
         <w:t xml:space="preserve">:</w:t>
       </w:r>
@@ -373,14 +388,16 @@
         <w:rPr>
           <w:rFonts w:ascii="Consolas" w:hAnsi="Consolas"/>
           <w:sz w:val="20"/>
-        </w:rPr>
-        <w:br/>
-      </w:r>
-      <w:r>
-        <w:rPr>
-          <w:rStyle w:val="NormalTok"/>
-          <w:rFonts w:ascii="Consolas" w:hAnsi="Consolas"/>
-          <w:sz w:val="20"/>
+          <w:shd w:fill="F5F5F5"/>
+        </w:rPr>
+        <w:br/>
+      </w:r>
+      <w:r>
+        <w:rPr>
+          <w:rStyle w:val="NormalTok"/>
+          <w:rFonts w:ascii="Consolas" w:hAnsi="Consolas"/>
+          <w:sz w:val="20"/>
+          <w:shd w:fill="F5F5F5"/>
         </w:rPr>
         <w:t xml:space="preserve">        </w:t>
       </w:r>
@@ -389,6 +406,7 @@
           <w:rStyle w:val="BuiltInTok"/>
           <w:rFonts w:ascii="Consolas" w:hAnsi="Consolas"/>
           <w:sz w:val="20"/>
+          <w:shd w:fill="F5F5F5"/>
         </w:rPr>
         <w:t xml:space="preserve">print</w:t>
       </w:r>
@@ -397,6 +415,7 @@
           <w:rStyle w:val="NormalTok"/>
           <w:rFonts w:ascii="Consolas" w:hAnsi="Consolas"/>
           <w:sz w:val="20"/>
+          <w:shd w:fill="F5F5F5"/>
         </w:rPr>
         <w:t xml:space="preserve">(</w:t>
       </w:r>
@@ -405,6 +424,7 @@
           <w:rStyle w:val="StringTok"/>
           <w:rFonts w:ascii="Consolas" w:hAnsi="Consolas"/>
           <w:sz w:val="20"/>
+          <w:shd w:fill="F5F5F5"/>
         </w:rPr>
         <w:t xml:space="preserve">'Blastoff!'</w:t>
       </w:r>
@@ -413,6 +433,7 @@
           <w:rStyle w:val="NormalTok"/>
           <w:rFonts w:ascii="Consolas" w:hAnsi="Consolas"/>
           <w:sz w:val="20"/>
+          <w:shd w:fill="F5F5F5"/>
         </w:rPr>
         <w:t xml:space="preserve">)</w:t>
       </w:r>
@@ -420,14 +441,16 @@
         <w:rPr>
           <w:rFonts w:ascii="Consolas" w:hAnsi="Consolas"/>
           <w:sz w:val="20"/>
-        </w:rPr>
-        <w:br/>
-      </w:r>
-      <w:r>
-        <w:rPr>
-          <w:rStyle w:val="NormalTok"/>
-          <w:rFonts w:ascii="Consolas" w:hAnsi="Consolas"/>
-          <w:sz w:val="20"/>
+          <w:shd w:fill="F5F5F5"/>
+        </w:rPr>
+        <w:br/>
+      </w:r>
+      <w:r>
+        <w:rPr>
+          <w:rStyle w:val="NormalTok"/>
+          <w:rFonts w:ascii="Consolas" w:hAnsi="Consolas"/>
+          <w:sz w:val="20"/>
+          <w:shd w:fill="F5F5F5"/>
         </w:rPr>
         <w:t xml:space="preserve">    </w:t>
       </w:r>
@@ -436,6 +459,7 @@
           <w:rStyle w:val="ControlFlowTok"/>
           <w:rFonts w:ascii="Consolas" w:hAnsi="Consolas"/>
           <w:sz w:val="20"/>
+          <w:shd w:fill="F5F5F5"/>
         </w:rPr>
         <w:t xml:space="preserve">else</w:t>
       </w:r>
@@ -444,6 +468,7 @@
           <w:rStyle w:val="NormalTok"/>
           <w:rFonts w:ascii="Consolas" w:hAnsi="Consolas"/>
           <w:sz w:val="20"/>
+          <w:shd w:fill="F5F5F5"/>
         </w:rPr>
         <w:t xml:space="preserve">:</w:t>
       </w:r>
@@ -451,14 +476,16 @@
         <w:rPr>
           <w:rFonts w:ascii="Consolas" w:hAnsi="Consolas"/>
           <w:sz w:val="20"/>
-        </w:rPr>
-        <w:br/>
-      </w:r>
-      <w:r>
-        <w:rPr>
-          <w:rStyle w:val="NormalTok"/>
-          <w:rFonts w:ascii="Consolas" w:hAnsi="Consolas"/>
-          <w:sz w:val="20"/>
+          <w:shd w:fill="F5F5F5"/>
+        </w:rPr>
+        <w:br/>
+      </w:r>
+      <w:r>
+        <w:rPr>
+          <w:rStyle w:val="NormalTok"/>
+          <w:rFonts w:ascii="Consolas" w:hAnsi="Consolas"/>
+          <w:sz w:val="20"/>
+          <w:shd w:fill="F5F5F5"/>
         </w:rPr>
         <w:t xml:space="preserve">        </w:t>
       </w:r>
@@ -467,6 +494,7 @@
           <w:rStyle w:val="BuiltInTok"/>
           <w:rFonts w:ascii="Consolas" w:hAnsi="Consolas"/>
           <w:sz w:val="20"/>
+          <w:shd w:fill="F5F5F5"/>
         </w:rPr>
         <w:t xml:space="preserve">print</w:t>
       </w:r>
@@ -475,6 +503,7 @@
           <w:rStyle w:val="NormalTok"/>
           <w:rFonts w:ascii="Consolas" w:hAnsi="Consolas"/>
           <w:sz w:val="20"/>
+          <w:shd w:fill="F5F5F5"/>
         </w:rPr>
         <w:t xml:space="preserve">(n)</w:t>
       </w:r>
@@ -482,14 +511,16 @@
         <w:rPr>
           <w:rFonts w:ascii="Consolas" w:hAnsi="Consolas"/>
           <w:sz w:val="20"/>
-        </w:rPr>
-        <w:br/>
-      </w:r>
-      <w:r>
-        <w:rPr>
-          <w:rStyle w:val="NormalTok"/>
-          <w:rFonts w:ascii="Consolas" w:hAnsi="Consolas"/>
-          <w:sz w:val="20"/>
+          <w:shd w:fill="F5F5F5"/>
+        </w:rPr>
+        <w:br/>
+      </w:r>
+      <w:r>
+        <w:rPr>
+          <w:rStyle w:val="NormalTok"/>
+          <w:rFonts w:ascii="Consolas" w:hAnsi="Consolas"/>
+          <w:sz w:val="20"/>
+          <w:shd w:fill="F5F5F5"/>
         </w:rPr>
         <w:t xml:space="preserve">        countdown(n</w:t>
       </w:r>
@@ -498,6 +529,7 @@
           <w:rStyle w:val="OperatorTok"/>
           <w:rFonts w:ascii="Consolas" w:hAnsi="Consolas"/>
           <w:sz w:val="20"/>
+          <w:shd w:fill="F5F5F5"/>
         </w:rPr>
         <w:t xml:space="preserve">-</w:t>
       </w:r>
@@ -506,6 +538,7 @@
           <w:rStyle w:val="DecValTok"/>
           <w:rFonts w:ascii="Consolas" w:hAnsi="Consolas"/>
           <w:sz w:val="20"/>
+          <w:shd w:fill="F5F5F5"/>
         </w:rPr>
         <w:t xml:space="preserve">1</w:t>
       </w:r>
@@ -514,6 +547,7 @@
           <w:rStyle w:val="NormalTok"/>
           <w:rFonts w:ascii="Consolas" w:hAnsi="Consolas"/>
           <w:sz w:val="20"/>
+          <w:shd w:fill="F5F5F5"/>
         </w:rPr>
         <w:t xml:space="preserve">)</w:t>
       </w:r>
@@ -521,13 +555,15 @@
         <w:rPr>
           <w:rFonts w:ascii="Consolas" w:hAnsi="Consolas"/>
           <w:sz w:val="20"/>
-        </w:rPr>
-        <w:br/>
-      </w:r>
-      <w:r>
-        <w:rPr>
-          <w:rFonts w:ascii="Consolas" w:hAnsi="Consolas"/>
-          <w:sz w:val="20"/>
+          <w:shd w:fill="F5F5F5"/>
+        </w:rPr>
+        <w:br/>
+      </w:r>
+      <w:r>
+        <w:rPr>
+          <w:rFonts w:ascii="Consolas" w:hAnsi="Consolas"/>
+          <w:sz w:val="20"/>
+          <w:shd w:fill="F5F5F5"/>
         </w:rPr>
         <w:br/>
       </w:r>
@@ -536,6 +572,7 @@
           <w:rStyle w:val="KeywordTok"/>
           <w:rFonts w:ascii="Consolas" w:hAnsi="Consolas"/>
           <w:sz w:val="20"/>
+          <w:shd w:fill="F5F5F5"/>
         </w:rPr>
         <w:t xml:space="preserve">def</w:t>
       </w:r>
@@ -544,6 +581,7 @@
           <w:rStyle w:val="NormalTok"/>
           <w:rFonts w:ascii="Consolas" w:hAnsi="Consolas"/>
           <w:sz w:val="20"/>
+          <w:shd w:fill="F5F5F5"/>
         </w:rPr>
         <w:t xml:space="preserve"> countup(n):</w:t>
       </w:r>
@@ -551,14 +589,16 @@
         <w:rPr>
           <w:rFonts w:ascii="Consolas" w:hAnsi="Consolas"/>
           <w:sz w:val="20"/>
-        </w:rPr>
-        <w:br/>
-      </w:r>
-      <w:r>
-        <w:rPr>
-          <w:rStyle w:val="NormalTok"/>
-          <w:rFonts w:ascii="Consolas" w:hAnsi="Consolas"/>
-          <w:sz w:val="20"/>
+          <w:shd w:fill="F5F5F5"/>
+        </w:rPr>
+        <w:br/>
+      </w:r>
+      <w:r>
+        <w:rPr>
+          <w:rStyle w:val="NormalTok"/>
+          <w:rFonts w:ascii="Consolas" w:hAnsi="Consolas"/>
+          <w:sz w:val="20"/>
+          <w:shd w:fill="F5F5F5"/>
         </w:rPr>
         <w:t xml:space="preserve">    </w:t>
       </w:r>
@@ -567,6 +607,7 @@
           <w:rStyle w:val="CommentTok"/>
           <w:rFonts w:ascii="Consolas" w:hAnsi="Consolas"/>
           <w:sz w:val="20"/>
+          <w:shd w:fill="F5F5F5"/>
         </w:rPr>
         <w:t xml:space="preserve">"""Recursive function that counts up from negative n to zero."""</w:t>
       </w:r>
@@ -574,14 +615,16 @@
         <w:rPr>
           <w:rFonts w:ascii="Consolas" w:hAnsi="Consolas"/>
           <w:sz w:val="20"/>
-        </w:rPr>
-        <w:br/>
-      </w:r>
-      <w:r>
-        <w:rPr>
-          <w:rStyle w:val="NormalTok"/>
-          <w:rFonts w:ascii="Consolas" w:hAnsi="Consolas"/>
-          <w:sz w:val="20"/>
+          <w:shd w:fill="F5F5F5"/>
+        </w:rPr>
+        <w:br/>
+      </w:r>
+      <w:r>
+        <w:rPr>
+          <w:rStyle w:val="NormalTok"/>
+          <w:rFonts w:ascii="Consolas" w:hAnsi="Consolas"/>
+          <w:sz w:val="20"/>
+          <w:shd w:fill="F5F5F5"/>
         </w:rPr>
         <w:t xml:space="preserve">    </w:t>
       </w:r>
@@ -590,6 +633,7 @@
           <w:rStyle w:val="ControlFlowTok"/>
           <w:rFonts w:ascii="Consolas" w:hAnsi="Consolas"/>
           <w:sz w:val="20"/>
+          <w:shd w:fill="F5F5F5"/>
         </w:rPr>
         <w:t xml:space="preserve">if</w:t>
       </w:r>
@@ -598,6 +642,7 @@
           <w:rStyle w:val="NormalTok"/>
           <w:rFonts w:ascii="Consolas" w:hAnsi="Consolas"/>
           <w:sz w:val="20"/>
+          <w:shd w:fill="F5F5F5"/>
         </w:rPr>
         <w:t xml:space="preserve"> n </w:t>
       </w:r>
@@ -606,6 +651,7 @@
           <w:rStyle w:val="OperatorTok"/>
           <w:rFonts w:ascii="Consolas" w:hAnsi="Consolas"/>
           <w:sz w:val="20"/>
+          <w:shd w:fill="F5F5F5"/>
         </w:rPr>
         <w:t xml:space="preserve">&lt;=</w:t>
       </w:r>
@@ -614,6 +660,7 @@
           <w:rStyle w:val="NormalTok"/>
           <w:rFonts w:ascii="Consolas" w:hAnsi="Consolas"/>
           <w:sz w:val="20"/>
+          <w:shd w:fill="F5F5F5"/>
         </w:rPr>
         <w:t xml:space="preserve"> </w:t>
       </w:r>
@@ -622,6 +669,7 @@
           <w:rStyle w:val="DecValTok"/>
           <w:rFonts w:ascii="Consolas" w:hAnsi="Consolas"/>
           <w:sz w:val="20"/>
+          <w:shd w:fill="F5F5F5"/>
         </w:rPr>
         <w:t xml:space="preserve">0</w:t>
       </w:r>
@@ -630,6 +678,7 @@
           <w:rStyle w:val="NormalTok"/>
           <w:rFonts w:ascii="Consolas" w:hAnsi="Consolas"/>
           <w:sz w:val="20"/>
+          <w:shd w:fill="F5F5F5"/>
         </w:rPr>
         <w:t xml:space="preserve">:</w:t>
       </w:r>
@@ -637,14 +686,16 @@
         <w:rPr>
           <w:rFonts w:ascii="Consolas" w:hAnsi="Consolas"/>
           <w:sz w:val="20"/>
-        </w:rPr>
-        <w:br/>
-      </w:r>
-      <w:r>
-        <w:rPr>
-          <w:rStyle w:val="NormalTok"/>
-          <w:rFonts w:ascii="Consolas" w:hAnsi="Consolas"/>
-          <w:sz w:val="20"/>
+          <w:shd w:fill="F5F5F5"/>
+        </w:rPr>
+        <w:br/>
+      </w:r>
+      <w:r>
+        <w:rPr>
+          <w:rStyle w:val="NormalTok"/>
+          <w:rFonts w:ascii="Consolas" w:hAnsi="Consolas"/>
+          <w:sz w:val="20"/>
+          <w:shd w:fill="F5F5F5"/>
         </w:rPr>
         <w:t xml:space="preserve">        </w:t>
       </w:r>
@@ -653,6 +704,7 @@
           <w:rStyle w:val="BuiltInTok"/>
           <w:rFonts w:ascii="Consolas" w:hAnsi="Consolas"/>
           <w:sz w:val="20"/>
+          <w:shd w:fill="F5F5F5"/>
         </w:rPr>
         <w:t xml:space="preserve">print</w:t>
       </w:r>
@@ -661,6 +713,7 @@
           <w:rStyle w:val="NormalTok"/>
           <w:rFonts w:ascii="Consolas" w:hAnsi="Consolas"/>
           <w:sz w:val="20"/>
+          <w:shd w:fill="F5F5F5"/>
         </w:rPr>
         <w:t xml:space="preserve">(n)</w:t>
       </w:r>
@@ -668,14 +721,16 @@
         <w:rPr>
           <w:rFonts w:ascii="Consolas" w:hAnsi="Consolas"/>
           <w:sz w:val="20"/>
-        </w:rPr>
-        <w:br/>
-      </w:r>
-      <w:r>
-        <w:rPr>
-          <w:rStyle w:val="NormalTok"/>
-          <w:rFonts w:ascii="Consolas" w:hAnsi="Consolas"/>
-          <w:sz w:val="20"/>
+          <w:shd w:fill="F5F5F5"/>
+        </w:rPr>
+        <w:br/>
+      </w:r>
+      <w:r>
+        <w:rPr>
+          <w:rStyle w:val="NormalTok"/>
+          <w:rFonts w:ascii="Consolas" w:hAnsi="Consolas"/>
+          <w:sz w:val="20"/>
+          <w:shd w:fill="F5F5F5"/>
         </w:rPr>
         <w:t xml:space="preserve">        </w:t>
       </w:r>
@@ -684,6 +739,7 @@
           <w:rStyle w:val="ControlFlowTok"/>
           <w:rFonts w:ascii="Consolas" w:hAnsi="Consolas"/>
           <w:sz w:val="20"/>
+          <w:shd w:fill="F5F5F5"/>
         </w:rPr>
         <w:t xml:space="preserve">if</w:t>
       </w:r>
@@ -692,6 +748,7 @@
           <w:rStyle w:val="NormalTok"/>
           <w:rFonts w:ascii="Consolas" w:hAnsi="Consolas"/>
           <w:sz w:val="20"/>
+          <w:shd w:fill="F5F5F5"/>
         </w:rPr>
         <w:t xml:space="preserve"> n </w:t>
       </w:r>
@@ -700,6 +757,7 @@
           <w:rStyle w:val="OperatorTok"/>
           <w:rFonts w:ascii="Consolas" w:hAnsi="Consolas"/>
           <w:sz w:val="20"/>
+          <w:shd w:fill="F5F5F5"/>
         </w:rPr>
         <w:t xml:space="preserve">==</w:t>
       </w:r>
@@ -708,6 +766,7 @@
           <w:rStyle w:val="NormalTok"/>
           <w:rFonts w:ascii="Consolas" w:hAnsi="Consolas"/>
           <w:sz w:val="20"/>
+          <w:shd w:fill="F5F5F5"/>
         </w:rPr>
         <w:t xml:space="preserve"> </w:t>
       </w:r>
@@ -716,6 +775,7 @@
           <w:rStyle w:val="DecValTok"/>
           <w:rFonts w:ascii="Consolas" w:hAnsi="Consolas"/>
           <w:sz w:val="20"/>
+          <w:shd w:fill="F5F5F5"/>
         </w:rPr>
         <w:t xml:space="preserve">0</w:t>
       </w:r>
@@ -724,6 +784,7 @@
           <w:rStyle w:val="NormalTok"/>
           <w:rFonts w:ascii="Consolas" w:hAnsi="Consolas"/>
           <w:sz w:val="20"/>
+          <w:shd w:fill="F5F5F5"/>
         </w:rPr>
         <w:t xml:space="preserve">:</w:t>
       </w:r>
@@ -731,14 +792,16 @@
         <w:rPr>
           <w:rFonts w:ascii="Consolas" w:hAnsi="Consolas"/>
           <w:sz w:val="20"/>
-        </w:rPr>
-        <w:br/>
-      </w:r>
-      <w:r>
-        <w:rPr>
-          <w:rStyle w:val="NormalTok"/>
-          <w:rFonts w:ascii="Consolas" w:hAnsi="Consolas"/>
-          <w:sz w:val="20"/>
+          <w:shd w:fill="F5F5F5"/>
+        </w:rPr>
+        <w:br/>
+      </w:r>
+      <w:r>
+        <w:rPr>
+          <w:rStyle w:val="NormalTok"/>
+          <w:rFonts w:ascii="Consolas" w:hAnsi="Consolas"/>
+          <w:sz w:val="20"/>
+          <w:shd w:fill="F5F5F5"/>
         </w:rPr>
         <w:t xml:space="preserve">            </w:t>
       </w:r>
@@ -747,6 +810,7 @@
           <w:rStyle w:val="BuiltInTok"/>
           <w:rFonts w:ascii="Consolas" w:hAnsi="Consolas"/>
           <w:sz w:val="20"/>
+          <w:shd w:fill="F5F5F5"/>
         </w:rPr>
         <w:t xml:space="preserve">print</w:t>
       </w:r>
@@ -755,6 +819,7 @@
           <w:rStyle w:val="NormalTok"/>
           <w:rFonts w:ascii="Consolas" w:hAnsi="Consolas"/>
           <w:sz w:val="20"/>
+          <w:shd w:fill="F5F5F5"/>
         </w:rPr>
         <w:t xml:space="preserve">(</w:t>
       </w:r>
@@ -763,6 +828,7 @@
           <w:rStyle w:val="StringTok"/>
           <w:rFonts w:ascii="Consolas" w:hAnsi="Consolas"/>
           <w:sz w:val="20"/>
+          <w:shd w:fill="F5F5F5"/>
         </w:rPr>
         <w:t xml:space="preserve">'Blastoff!'</w:t>
       </w:r>
@@ -771,6 +837,7 @@
           <w:rStyle w:val="NormalTok"/>
           <w:rFonts w:ascii="Consolas" w:hAnsi="Consolas"/>
           <w:sz w:val="20"/>
+          <w:shd w:fill="F5F5F5"/>
         </w:rPr>
         <w:t xml:space="preserve">)</w:t>
       </w:r>
@@ -778,14 +845,16 @@
         <w:rPr>
           <w:rFonts w:ascii="Consolas" w:hAnsi="Consolas"/>
           <w:sz w:val="20"/>
-        </w:rPr>
-        <w:br/>
-      </w:r>
-      <w:r>
-        <w:rPr>
-          <w:rStyle w:val="NormalTok"/>
-          <w:rFonts w:ascii="Consolas" w:hAnsi="Consolas"/>
-          <w:sz w:val="20"/>
+          <w:shd w:fill="F5F5F5"/>
+        </w:rPr>
+        <w:br/>
+      </w:r>
+      <w:r>
+        <w:rPr>
+          <w:rStyle w:val="NormalTok"/>
+          <w:rFonts w:ascii="Consolas" w:hAnsi="Consolas"/>
+          <w:sz w:val="20"/>
+          <w:shd w:fill="F5F5F5"/>
         </w:rPr>
         <w:t xml:space="preserve">        </w:t>
       </w:r>
@@ -794,6 +863,7 @@
           <w:rStyle w:val="ControlFlowTok"/>
           <w:rFonts w:ascii="Consolas" w:hAnsi="Consolas"/>
           <w:sz w:val="20"/>
+          <w:shd w:fill="F5F5F5"/>
         </w:rPr>
         <w:t xml:space="preserve">else</w:t>
       </w:r>
@@ -802,6 +872,7 @@
           <w:rStyle w:val="NormalTok"/>
           <w:rFonts w:ascii="Consolas" w:hAnsi="Consolas"/>
           <w:sz w:val="20"/>
+          <w:shd w:fill="F5F5F5"/>
         </w:rPr>
         <w:t xml:space="preserve">:</w:t>
       </w:r>
@@ -809,14 +880,16 @@
         <w:rPr>
           <w:rFonts w:ascii="Consolas" w:hAnsi="Consolas"/>
           <w:sz w:val="20"/>
-        </w:rPr>
-        <w:br/>
-      </w:r>
-      <w:r>
-        <w:rPr>
-          <w:rStyle w:val="NormalTok"/>
-          <w:rFonts w:ascii="Consolas" w:hAnsi="Consolas"/>
-          <w:sz w:val="20"/>
+          <w:shd w:fill="F5F5F5"/>
+        </w:rPr>
+        <w:br/>
+      </w:r>
+      <w:r>
+        <w:rPr>
+          <w:rStyle w:val="NormalTok"/>
+          <w:rFonts w:ascii="Consolas" w:hAnsi="Consolas"/>
+          <w:sz w:val="20"/>
+          <w:shd w:fill="F5F5F5"/>
         </w:rPr>
         <w:t xml:space="preserve">            countup(n</w:t>
       </w:r>
@@ -825,6 +898,7 @@
           <w:rStyle w:val="OperatorTok"/>
           <w:rFonts w:ascii="Consolas" w:hAnsi="Consolas"/>
           <w:sz w:val="20"/>
+          <w:shd w:fill="F5F5F5"/>
         </w:rPr>
         <w:t xml:space="preserve">+</w:t>
       </w:r>
@@ -833,6 +907,7 @@
           <w:rStyle w:val="DecValTok"/>
           <w:rFonts w:ascii="Consolas" w:hAnsi="Consolas"/>
           <w:sz w:val="20"/>
+          <w:shd w:fill="F5F5F5"/>
         </w:rPr>
         <w:t xml:space="preserve">1</w:t>
       </w:r>
@@ -841,6 +916,7 @@
           <w:rStyle w:val="NormalTok"/>
           <w:rFonts w:ascii="Consolas" w:hAnsi="Consolas"/>
           <w:sz w:val="20"/>
+          <w:shd w:fill="F5F5F5"/>
         </w:rPr>
         <w:t xml:space="preserve">)</w:t>
       </w:r>
@@ -848,13 +924,15 @@
         <w:rPr>
           <w:rFonts w:ascii="Consolas" w:hAnsi="Consolas"/>
           <w:sz w:val="20"/>
-        </w:rPr>
-        <w:br/>
-      </w:r>
-      <w:r>
-        <w:rPr>
-          <w:rFonts w:ascii="Consolas" w:hAnsi="Consolas"/>
-          <w:sz w:val="20"/>
+          <w:shd w:fill="F5F5F5"/>
+        </w:rPr>
+        <w:br/>
+      </w:r>
+      <w:r>
+        <w:rPr>
+          <w:rFonts w:ascii="Consolas" w:hAnsi="Consolas"/>
+          <w:sz w:val="20"/>
+          <w:shd w:fill="F5F5F5"/>
         </w:rPr>
         <w:br/>
       </w:r>
@@ -863,6 +941,7 @@
           <w:rStyle w:val="CommentTok"/>
           <w:rFonts w:ascii="Consolas" w:hAnsi="Consolas"/>
           <w:sz w:val="20"/>
+          <w:shd w:fill="F5F5F5"/>
         </w:rPr>
         <w:t xml:space="preserve"># Main program</w:t>
       </w:r>
@@ -870,14 +949,16 @@
         <w:rPr>
           <w:rFonts w:ascii="Consolas" w:hAnsi="Consolas"/>
           <w:sz w:val="20"/>
-        </w:rPr>
-        <w:br/>
-      </w:r>
-      <w:r>
-        <w:rPr>
-          <w:rStyle w:val="NormalTok"/>
-          <w:rFonts w:ascii="Consolas" w:hAnsi="Consolas"/>
-          <w:sz w:val="20"/>
+          <w:shd w:fill="F5F5F5"/>
+        </w:rPr>
+        <w:br/>
+      </w:r>
+      <w:r>
+        <w:rPr>
+          <w:rStyle w:val="NormalTok"/>
+          <w:rFonts w:ascii="Consolas" w:hAnsi="Consolas"/>
+          <w:sz w:val="20"/>
+          <w:shd w:fill="F5F5F5"/>
         </w:rPr>
         <w:t xml:space="preserve">number </w:t>
       </w:r>
@@ -886,6 +967,7 @@
           <w:rStyle w:val="OperatorTok"/>
           <w:rFonts w:ascii="Consolas" w:hAnsi="Consolas"/>
           <w:sz w:val="20"/>
+          <w:shd w:fill="F5F5F5"/>
         </w:rPr>
         <w:t xml:space="preserve">=</w:t>
       </w:r>
@@ -894,6 +976,7 @@
           <w:rStyle w:val="NormalTok"/>
           <w:rFonts w:ascii="Consolas" w:hAnsi="Consolas"/>
           <w:sz w:val="20"/>
+          <w:shd w:fill="F5F5F5"/>
         </w:rPr>
         <w:t xml:space="preserve"> </w:t>
       </w:r>
@@ -902,6 +985,7 @@
           <w:rStyle w:val="BuiltInTok"/>
           <w:rFonts w:ascii="Consolas" w:hAnsi="Consolas"/>
           <w:sz w:val="20"/>
+          <w:shd w:fill="F5F5F5"/>
         </w:rPr>
         <w:t xml:space="preserve">int</w:t>
       </w:r>
@@ -910,6 +994,7 @@
           <w:rStyle w:val="NormalTok"/>
           <w:rFonts w:ascii="Consolas" w:hAnsi="Consolas"/>
           <w:sz w:val="20"/>
+          <w:shd w:fill="F5F5F5"/>
         </w:rPr>
         <w:t xml:space="preserve">(</w:t>
       </w:r>
@@ -918,6 +1003,7 @@
           <w:rStyle w:val="BuiltInTok"/>
           <w:rFonts w:ascii="Consolas" w:hAnsi="Consolas"/>
           <w:sz w:val="20"/>
+          <w:shd w:fill="F5F5F5"/>
         </w:rPr>
         <w:t xml:space="preserve">input</w:t>
       </w:r>
@@ -926,6 +1012,7 @@
           <w:rStyle w:val="NormalTok"/>
           <w:rFonts w:ascii="Consolas" w:hAnsi="Consolas"/>
           <w:sz w:val="20"/>
+          <w:shd w:fill="F5F5F5"/>
         </w:rPr>
         <w:t xml:space="preserve">(</w:t>
       </w:r>
@@ -934,6 +1021,7 @@
           <w:rStyle w:val="StringTok"/>
           <w:rFonts w:ascii="Consolas" w:hAnsi="Consolas"/>
           <w:sz w:val="20"/>
+          <w:shd w:fill="F5F5F5"/>
         </w:rPr>
         <w:t xml:space="preserve">"Enter a number: "</w:t>
       </w:r>
@@ -942,6 +1030,7 @@
           <w:rStyle w:val="NormalTok"/>
           <w:rFonts w:ascii="Consolas" w:hAnsi="Consolas"/>
           <w:sz w:val="20"/>
+          <w:shd w:fill="F5F5F5"/>
         </w:rPr>
         <w:t xml:space="preserve">))</w:t>
       </w:r>
@@ -949,13 +1038,15 @@
         <w:rPr>
           <w:rFonts w:ascii="Consolas" w:hAnsi="Consolas"/>
           <w:sz w:val="20"/>
-        </w:rPr>
-        <w:br/>
-      </w:r>
-      <w:r>
-        <w:rPr>
-          <w:rFonts w:ascii="Consolas" w:hAnsi="Consolas"/>
-          <w:sz w:val="20"/>
+          <w:shd w:fill="F5F5F5"/>
+        </w:rPr>
+        <w:br/>
+      </w:r>
+      <w:r>
+        <w:rPr>
+          <w:rFonts w:ascii="Consolas" w:hAnsi="Consolas"/>
+          <w:sz w:val="20"/>
+          <w:shd w:fill="F5F5F5"/>
         </w:rPr>
         <w:br/>
       </w:r>
@@ -964,6 +1055,7 @@
           <w:rStyle w:val="ControlFlowTok"/>
           <w:rFonts w:ascii="Consolas" w:hAnsi="Consolas"/>
           <w:sz w:val="20"/>
+          <w:shd w:fill="F5F5F5"/>
         </w:rPr>
         <w:t xml:space="preserve">if</w:t>
       </w:r>
@@ -972,6 +1064,7 @@
           <w:rStyle w:val="NormalTok"/>
           <w:rFonts w:ascii="Consolas" w:hAnsi="Consolas"/>
           <w:sz w:val="20"/>
+          <w:shd w:fill="F5F5F5"/>
         </w:rPr>
         <w:t xml:space="preserve"> number </w:t>
       </w:r>
@@ -980,6 +1073,7 @@
           <w:rStyle w:val="OperatorTok"/>
           <w:rFonts w:ascii="Consolas" w:hAnsi="Consolas"/>
           <w:sz w:val="20"/>
+          <w:shd w:fill="F5F5F5"/>
         </w:rPr>
         <w:t xml:space="preserve">&gt;</w:t>
       </w:r>
@@ -988,6 +1082,7 @@
           <w:rStyle w:val="NormalTok"/>
           <w:rFonts w:ascii="Consolas" w:hAnsi="Consolas"/>
           <w:sz w:val="20"/>
+          <w:shd w:fill="F5F5F5"/>
         </w:rPr>
         <w:t xml:space="preserve"> </w:t>
       </w:r>
@@ -996,6 +1091,7 @@
           <w:rStyle w:val="DecValTok"/>
           <w:rFonts w:ascii="Consolas" w:hAnsi="Consolas"/>
           <w:sz w:val="20"/>
+          <w:shd w:fill="F5F5F5"/>
         </w:rPr>
         <w:t xml:space="preserve">0</w:t>
       </w:r>
@@ -1004,6 +1100,7 @@
           <w:rStyle w:val="NormalTok"/>
           <w:rFonts w:ascii="Consolas" w:hAnsi="Consolas"/>
           <w:sz w:val="20"/>
+          <w:shd w:fill="F5F5F5"/>
         </w:rPr>
         <w:t xml:space="preserve">:</w:t>
       </w:r>
@@ -1011,14 +1108,16 @@
         <w:rPr>
           <w:rFonts w:ascii="Consolas" w:hAnsi="Consolas"/>
           <w:sz w:val="20"/>
-        </w:rPr>
-        <w:br/>
-      </w:r>
-      <w:r>
-        <w:rPr>
-          <w:rStyle w:val="NormalTok"/>
-          <w:rFonts w:ascii="Consolas" w:hAnsi="Consolas"/>
-          <w:sz w:val="20"/>
+          <w:shd w:fill="F5F5F5"/>
+        </w:rPr>
+        <w:br/>
+      </w:r>
+      <w:r>
+        <w:rPr>
+          <w:rStyle w:val="NormalTok"/>
+          <w:rFonts w:ascii="Consolas" w:hAnsi="Consolas"/>
+          <w:sz w:val="20"/>
+          <w:shd w:fill="F5F5F5"/>
         </w:rPr>
         <w:t xml:space="preserve">    countdown(number)</w:t>
       </w:r>
@@ -1026,6 +1125,7 @@
         <w:rPr>
           <w:rFonts w:ascii="Consolas" w:hAnsi="Consolas"/>
           <w:sz w:val="20"/>
+          <w:shd w:fill="F5F5F5"/>
         </w:rPr>
         <w:br/>
       </w:r>
@@ -1034,6 +1134,7 @@
           <w:rStyle w:val="ControlFlowTok"/>
           <w:rFonts w:ascii="Consolas" w:hAnsi="Consolas"/>
           <w:sz w:val="20"/>
+          <w:shd w:fill="F5F5F5"/>
         </w:rPr>
         <w:t xml:space="preserve">elif</w:t>
       </w:r>
@@ -1042,6 +1143,7 @@
           <w:rStyle w:val="NormalTok"/>
           <w:rFonts w:ascii="Consolas" w:hAnsi="Consolas"/>
           <w:sz w:val="20"/>
+          <w:shd w:fill="F5F5F5"/>
         </w:rPr>
         <w:t xml:space="preserve"> number </w:t>
       </w:r>
@@ -1050,6 +1152,7 @@
           <w:rStyle w:val="OperatorTok"/>
           <w:rFonts w:ascii="Consolas" w:hAnsi="Consolas"/>
           <w:sz w:val="20"/>
+          <w:shd w:fill="F5F5F5"/>
         </w:rPr>
         <w:t xml:space="preserve">&lt;</w:t>
       </w:r>
@@ -1058,6 +1161,7 @@
           <w:rStyle w:val="NormalTok"/>
           <w:rFonts w:ascii="Consolas" w:hAnsi="Consolas"/>
           <w:sz w:val="20"/>
+          <w:shd w:fill="F5F5F5"/>
         </w:rPr>
         <w:t xml:space="preserve"> </w:t>
       </w:r>
@@ -1066,6 +1170,7 @@
           <w:rStyle w:val="DecValTok"/>
           <w:rFonts w:ascii="Consolas" w:hAnsi="Consolas"/>
           <w:sz w:val="20"/>
+          <w:shd w:fill="F5F5F5"/>
         </w:rPr>
         <w:t xml:space="preserve">0</w:t>
       </w:r>
@@ -1074,6 +1179,7 @@
           <w:rStyle w:val="NormalTok"/>
           <w:rFonts w:ascii="Consolas" w:hAnsi="Consolas"/>
           <w:sz w:val="20"/>
+          <w:shd w:fill="F5F5F5"/>
         </w:rPr>
         <w:t xml:space="preserve">:</w:t>
       </w:r>
@@ -1081,14 +1187,16 @@
         <w:rPr>
           <w:rFonts w:ascii="Consolas" w:hAnsi="Consolas"/>
           <w:sz w:val="20"/>
-        </w:rPr>
-        <w:br/>
-      </w:r>
-      <w:r>
-        <w:rPr>
-          <w:rStyle w:val="NormalTok"/>
-          <w:rFonts w:ascii="Consolas" w:hAnsi="Consolas"/>
-          <w:sz w:val="20"/>
+          <w:shd w:fill="F5F5F5"/>
+        </w:rPr>
+        <w:br/>
+      </w:r>
+      <w:r>
+        <w:rPr>
+          <w:rStyle w:val="NormalTok"/>
+          <w:rFonts w:ascii="Consolas" w:hAnsi="Consolas"/>
+          <w:sz w:val="20"/>
+          <w:shd w:fill="F5F5F5"/>
         </w:rPr>
         <w:t xml:space="preserve">    countup(number)</w:t>
       </w:r>
@@ -1096,6 +1204,7 @@
         <w:rPr>
           <w:rFonts w:ascii="Consolas" w:hAnsi="Consolas"/>
           <w:sz w:val="20"/>
+          <w:shd w:fill="F5F5F5"/>
         </w:rPr>
         <w:br/>
       </w:r>
@@ -1104,6 +1213,7 @@
           <w:rStyle w:val="ControlFlowTok"/>
           <w:rFonts w:ascii="Consolas" w:hAnsi="Consolas"/>
           <w:sz w:val="20"/>
+          <w:shd w:fill="F5F5F5"/>
         </w:rPr>
         <w:t xml:space="preserve">else</w:t>
       </w:r>
@@ -1112,6 +1222,7 @@
           <w:rStyle w:val="NormalTok"/>
           <w:rFonts w:ascii="Consolas" w:hAnsi="Consolas"/>
           <w:sz w:val="20"/>
+          <w:shd w:fill="F5F5F5"/>
         </w:rPr>
         <w:t xml:space="preserve">:</w:t>
       </w:r>
@@ -1119,14 +1230,16 @@
         <w:rPr>
           <w:rFonts w:ascii="Consolas" w:hAnsi="Consolas"/>
           <w:sz w:val="20"/>
-        </w:rPr>
-        <w:br/>
-      </w:r>
-      <w:r>
-        <w:rPr>
-          <w:rStyle w:val="NormalTok"/>
-          <w:rFonts w:ascii="Consolas" w:hAnsi="Consolas"/>
-          <w:sz w:val="20"/>
+          <w:shd w:fill="F5F5F5"/>
+        </w:rPr>
+        <w:br/>
+      </w:r>
+      <w:r>
+        <w:rPr>
+          <w:rStyle w:val="NormalTok"/>
+          <w:rFonts w:ascii="Consolas" w:hAnsi="Consolas"/>
+          <w:sz w:val="20"/>
+          <w:shd w:fill="F5F5F5"/>
         </w:rPr>
         <w:t xml:space="preserve">    countdown(number)</w:t>
       </w:r>
@@ -1149,7 +1262,8 @@
     <w:p>
       <w:pPr>
         <w:pStyle w:val="SourceCode"/>
-        <w:spacing w:line="480" w:lineRule="auto"/>
+        <w:spacing w:line="240" w:lineRule="auto"/>
+        <w:ind w:left="720"/>
       </w:pPr>
       <w:r>
         <w:rPr>
@@ -1223,173 +1337,174 @@
     <w:p>
       <w:pPr>
         <w:pStyle w:val="FirstParagraph"/>
-        <w:spacing w:line="480" w:lineRule="auto"/>
-      </w:pPr>
-      <w:r>
-        <w:rPr>
-          <w:rFonts w:ascii="Times New Roman" w:hAnsi="Times New Roman"/>
+        <w:spacing w:line="240" w:lineRule="auto"/>
+        <w:ind w:left="720"/>
+      </w:pPr>
+      <w:r>
+        <w:rPr>
+          <w:rFonts w:ascii="Consolas" w:hAnsi="Consolas"/>
           <w:b/>
           <w:bCs/>
-          <w:sz w:val="24"/>
+          <w:sz w:val="20"/>
         </w:rPr>
         <w:t xml:space="preserve">Explanation</w:t>
       </w:r>
       <w:r>
         <w:rPr>
-          <w:rFonts w:ascii="Times New Roman" w:hAnsi="Times New Roman"/>
-          <w:sz w:val="24"/>
+          <w:rFonts w:ascii="Consolas" w:hAnsi="Consolas"/>
+          <w:sz w:val="20"/>
         </w:rPr>
         <w:t xml:space="preserve">: When the user enters 3, the program evaluates the condition</w:t>
       </w:r>
       <w:r>
         <w:rPr>
-          <w:rFonts w:ascii="Times New Roman" w:hAnsi="Times New Roman"/>
-          <w:sz w:val="24"/>
+          <w:rFonts w:ascii="Consolas" w:hAnsi="Consolas"/>
+          <w:sz w:val="20"/>
         </w:rPr>
         <w:t xml:space="preserve"> </w:t>
       </w:r>
       <w:r>
         <w:rPr>
           <w:rStyle w:val="VerbatimChar"/>
-          <w:rFonts w:ascii="Times New Roman" w:hAnsi="Times New Roman"/>
-          <w:sz w:val="24"/>
+          <w:rFonts w:ascii="Consolas" w:hAnsi="Consolas"/>
+          <w:sz w:val="20"/>
         </w:rPr>
         <w:t xml:space="preserve">number &gt; 0</w:t>
       </w:r>
       <w:r>
         <w:rPr>
-          <w:rFonts w:ascii="Times New Roman" w:hAnsi="Times New Roman"/>
-          <w:sz w:val="24"/>
+          <w:rFonts w:ascii="Consolas" w:hAnsi="Consolas"/>
+          <w:sz w:val="20"/>
         </w:rPr>
         <w:t xml:space="preserve"> </w:t>
       </w:r>
       <w:r>
         <w:rPr>
-          <w:rFonts w:ascii="Times New Roman" w:hAnsi="Times New Roman"/>
-          <w:sz w:val="24"/>
+          <w:rFonts w:ascii="Consolas" w:hAnsi="Consolas"/>
+          <w:sz w:val="20"/>
         </w:rPr>
         <w:t xml:space="preserve">as true and calls</w:t>
       </w:r>
       <w:r>
         <w:rPr>
-          <w:rFonts w:ascii="Times New Roman" w:hAnsi="Times New Roman"/>
-          <w:sz w:val="24"/>
+          <w:rFonts w:ascii="Consolas" w:hAnsi="Consolas"/>
+          <w:sz w:val="20"/>
         </w:rPr>
         <w:t xml:space="preserve"> </w:t>
       </w:r>
       <w:r>
         <w:rPr>
           <w:rStyle w:val="VerbatimChar"/>
-          <w:rFonts w:ascii="Times New Roman" w:hAnsi="Times New Roman"/>
-          <w:sz w:val="24"/>
+          <w:rFonts w:ascii="Consolas" w:hAnsi="Consolas"/>
+          <w:sz w:val="20"/>
         </w:rPr>
         <w:t xml:space="preserve">countdown(3)</w:t>
       </w:r>
       <w:r>
         <w:rPr>
-          <w:rFonts w:ascii="Times New Roman" w:hAnsi="Times New Roman"/>
-          <w:sz w:val="24"/>
+          <w:rFonts w:ascii="Consolas" w:hAnsi="Consolas"/>
+          <w:sz w:val="20"/>
         </w:rPr>
         <w:t xml:space="preserve">. The function prints 3, then recursively calls</w:t>
       </w:r>
       <w:r>
         <w:rPr>
-          <w:rFonts w:ascii="Times New Roman" w:hAnsi="Times New Roman"/>
-          <w:sz w:val="24"/>
+          <w:rFonts w:ascii="Consolas" w:hAnsi="Consolas"/>
+          <w:sz w:val="20"/>
         </w:rPr>
         <w:t xml:space="preserve"> </w:t>
       </w:r>
       <w:r>
         <w:rPr>
           <w:rStyle w:val="VerbatimChar"/>
-          <w:rFonts w:ascii="Times New Roman" w:hAnsi="Times New Roman"/>
-          <w:sz w:val="24"/>
+          <w:rFonts w:ascii="Consolas" w:hAnsi="Consolas"/>
+          <w:sz w:val="20"/>
         </w:rPr>
         <w:t xml:space="preserve">countdown(2)</w:t>
       </w:r>
       <w:r>
         <w:rPr>
-          <w:rFonts w:ascii="Times New Roman" w:hAnsi="Times New Roman"/>
-          <w:sz w:val="24"/>
+          <w:rFonts w:ascii="Consolas" w:hAnsi="Consolas"/>
+          <w:sz w:val="20"/>
         </w:rPr>
         <w:t xml:space="preserve">, which prints 2, then</w:t>
       </w:r>
       <w:r>
         <w:rPr>
-          <w:rFonts w:ascii="Times New Roman" w:hAnsi="Times New Roman"/>
-          <w:sz w:val="24"/>
+          <w:rFonts w:ascii="Consolas" w:hAnsi="Consolas"/>
+          <w:sz w:val="20"/>
         </w:rPr>
         <w:t xml:space="preserve"> </w:t>
       </w:r>
       <w:r>
         <w:rPr>
           <w:rStyle w:val="VerbatimChar"/>
-          <w:rFonts w:ascii="Times New Roman" w:hAnsi="Times New Roman"/>
-          <w:sz w:val="24"/>
+          <w:rFonts w:ascii="Consolas" w:hAnsi="Consolas"/>
+          <w:sz w:val="20"/>
         </w:rPr>
         <w:t xml:space="preserve">countdown(1)</w:t>
       </w:r>
       <w:r>
         <w:rPr>
-          <w:rFonts w:ascii="Times New Roman" w:hAnsi="Times New Roman"/>
-          <w:sz w:val="24"/>
+          <w:rFonts w:ascii="Consolas" w:hAnsi="Consolas"/>
+          <w:sz w:val="20"/>
         </w:rPr>
         <w:t xml:space="preserve">, which prints 1, and finally</w:t>
       </w:r>
       <w:r>
         <w:rPr>
-          <w:rFonts w:ascii="Times New Roman" w:hAnsi="Times New Roman"/>
-          <w:sz w:val="24"/>
+          <w:rFonts w:ascii="Consolas" w:hAnsi="Consolas"/>
+          <w:sz w:val="20"/>
         </w:rPr>
         <w:t xml:space="preserve"> </w:t>
       </w:r>
       <w:r>
         <w:rPr>
           <w:rStyle w:val="VerbatimChar"/>
-          <w:rFonts w:ascii="Times New Roman" w:hAnsi="Times New Roman"/>
-          <w:sz w:val="24"/>
+          <w:rFonts w:ascii="Consolas" w:hAnsi="Consolas"/>
+          <w:sz w:val="20"/>
         </w:rPr>
         <w:t xml:space="preserve">countdown(0)</w:t>
       </w:r>
       <w:r>
         <w:rPr>
-          <w:rFonts w:ascii="Times New Roman" w:hAnsi="Times New Roman"/>
-          <w:sz w:val="24"/>
+          <w:rFonts w:ascii="Consolas" w:hAnsi="Consolas"/>
+          <w:sz w:val="20"/>
         </w:rPr>
         <w:t xml:space="preserve">, which triggers the base case and prints</w:t>
       </w:r>
       <w:r>
         <w:rPr>
-          <w:rFonts w:ascii="Times New Roman" w:hAnsi="Times New Roman"/>
-          <w:sz w:val="24"/>
+          <w:rFonts w:ascii="Consolas" w:hAnsi="Consolas"/>
+          <w:sz w:val="20"/>
         </w:rPr>
         <w:t xml:space="preserve"> </w:t>
       </w:r>
       <w:r>
         <w:rPr>
-          <w:rFonts w:ascii="Times New Roman" w:hAnsi="Times New Roman"/>
-          <w:sz w:val="24"/>
+          <w:rFonts w:ascii="Consolas" w:hAnsi="Consolas"/>
+          <w:sz w:val="20"/>
         </w:rPr>
         <w:t xml:space="preserve">“</w:t>
       </w:r>
       <w:r>
         <w:rPr>
-          <w:rFonts w:ascii="Times New Roman" w:hAnsi="Times New Roman"/>
-          <w:sz w:val="24"/>
+          <w:rFonts w:ascii="Consolas" w:hAnsi="Consolas"/>
+          <w:sz w:val="20"/>
         </w:rPr>
         <w:t xml:space="preserve">Blastoff!</w:t>
       </w:r>
       <w:r>
         <w:rPr>
-          <w:rFonts w:ascii="Times New Roman" w:hAnsi="Times New Roman"/>
-          <w:sz w:val="24"/>
+          <w:rFonts w:ascii="Consolas" w:hAnsi="Consolas"/>
+          <w:sz w:val="20"/>
         </w:rPr>
         <w:t xml:space="preserve">”</w:t>
       </w:r>
       <w:r>
         <w:rPr>
-          <w:rFonts w:ascii="Times New Roman" w:hAnsi="Times New Roman"/>
-          <w:sz w:val="24"/>
+          <w:rFonts w:ascii="Consolas" w:hAnsi="Consolas"/>
+          <w:sz w:val="20"/>
         </w:rPr>
         <w:t xml:space="preserve">.</w:t>
       </w:r>
@@ -1412,7 +1527,8 @@
     <w:p>
       <w:pPr>
         <w:pStyle w:val="SourceCode"/>
-        <w:spacing w:line="480" w:lineRule="auto"/>
+        <w:spacing w:line="240" w:lineRule="auto"/>
+        <w:ind w:left="720"/>
       </w:pPr>
       <w:r>
         <w:rPr>
@@ -1501,180 +1617,181 @@
     <w:p>
       <w:pPr>
         <w:pStyle w:val="FirstParagraph"/>
-        <w:spacing w:line="480" w:lineRule="auto"/>
-      </w:pPr>
-      <w:r>
-        <w:rPr>
-          <w:rFonts w:ascii="Times New Roman" w:hAnsi="Times New Roman"/>
+        <w:spacing w:line="240" w:lineRule="auto"/>
+        <w:ind w:left="720"/>
+      </w:pPr>
+      <w:r>
+        <w:rPr>
+          <w:rFonts w:ascii="Consolas" w:hAnsi="Consolas"/>
           <w:b/>
           <w:bCs/>
-          <w:sz w:val="24"/>
+          <w:sz w:val="20"/>
         </w:rPr>
         <w:t xml:space="preserve">Explanation</w:t>
       </w:r>
       <w:r>
         <w:rPr>
-          <w:rFonts w:ascii="Times New Roman" w:hAnsi="Times New Roman"/>
-          <w:sz w:val="24"/>
+          <w:rFonts w:ascii="Consolas" w:hAnsi="Consolas"/>
+          <w:sz w:val="20"/>
         </w:rPr>
         <w:t xml:space="preserve">: When the user enters -3, the program evaluates the condition</w:t>
       </w:r>
       <w:r>
         <w:rPr>
-          <w:rFonts w:ascii="Times New Roman" w:hAnsi="Times New Roman"/>
-          <w:sz w:val="24"/>
+          <w:rFonts w:ascii="Consolas" w:hAnsi="Consolas"/>
+          <w:sz w:val="20"/>
         </w:rPr>
         <w:t xml:space="preserve"> </w:t>
       </w:r>
       <w:r>
         <w:rPr>
           <w:rStyle w:val="VerbatimChar"/>
-          <w:rFonts w:ascii="Times New Roman" w:hAnsi="Times New Roman"/>
-          <w:sz w:val="24"/>
+          <w:rFonts w:ascii="Consolas" w:hAnsi="Consolas"/>
+          <w:sz w:val="20"/>
         </w:rPr>
         <w:t xml:space="preserve">number &lt; 0</w:t>
       </w:r>
       <w:r>
         <w:rPr>
-          <w:rFonts w:ascii="Times New Roman" w:hAnsi="Times New Roman"/>
-          <w:sz w:val="24"/>
+          <w:rFonts w:ascii="Consolas" w:hAnsi="Consolas"/>
+          <w:sz w:val="20"/>
         </w:rPr>
         <w:t xml:space="preserve"> </w:t>
       </w:r>
       <w:r>
         <w:rPr>
-          <w:rFonts w:ascii="Times New Roman" w:hAnsi="Times New Roman"/>
-          <w:sz w:val="24"/>
+          <w:rFonts w:ascii="Consolas" w:hAnsi="Consolas"/>
+          <w:sz w:val="20"/>
         </w:rPr>
         <w:t xml:space="preserve">as true and calls</w:t>
       </w:r>
       <w:r>
         <w:rPr>
-          <w:rFonts w:ascii="Times New Roman" w:hAnsi="Times New Roman"/>
-          <w:sz w:val="24"/>
+          <w:rFonts w:ascii="Consolas" w:hAnsi="Consolas"/>
+          <w:sz w:val="20"/>
         </w:rPr>
         <w:t xml:space="preserve"> </w:t>
       </w:r>
       <w:r>
         <w:rPr>
           <w:rStyle w:val="VerbatimChar"/>
-          <w:rFonts w:ascii="Times New Roman" w:hAnsi="Times New Roman"/>
-          <w:sz w:val="24"/>
+          <w:rFonts w:ascii="Consolas" w:hAnsi="Consolas"/>
+          <w:sz w:val="20"/>
         </w:rPr>
         <w:t xml:space="preserve">countup(-3)</w:t>
       </w:r>
       <w:r>
         <w:rPr>
-          <w:rFonts w:ascii="Times New Roman" w:hAnsi="Times New Roman"/>
-          <w:sz w:val="24"/>
+          <w:rFonts w:ascii="Consolas" w:hAnsi="Consolas"/>
+          <w:sz w:val="20"/>
         </w:rPr>
         <w:t xml:space="preserve">. The function prints -3, then recursively calls</w:t>
       </w:r>
       <w:r>
         <w:rPr>
-          <w:rFonts w:ascii="Times New Roman" w:hAnsi="Times New Roman"/>
-          <w:sz w:val="24"/>
+          <w:rFonts w:ascii="Consolas" w:hAnsi="Consolas"/>
+          <w:sz w:val="20"/>
         </w:rPr>
         <w:t xml:space="preserve"> </w:t>
       </w:r>
       <w:r>
         <w:rPr>
           <w:rStyle w:val="VerbatimChar"/>
-          <w:rFonts w:ascii="Times New Roman" w:hAnsi="Times New Roman"/>
-          <w:sz w:val="24"/>
+          <w:rFonts w:ascii="Consolas" w:hAnsi="Consolas"/>
+          <w:sz w:val="20"/>
         </w:rPr>
         <w:t xml:space="preserve">countup(-2)</w:t>
       </w:r>
       <w:r>
         <w:rPr>
-          <w:rFonts w:ascii="Times New Roman" w:hAnsi="Times New Roman"/>
-          <w:sz w:val="24"/>
+          <w:rFonts w:ascii="Consolas" w:hAnsi="Consolas"/>
+          <w:sz w:val="20"/>
         </w:rPr>
         <w:t xml:space="preserve">, which prints -2, then</w:t>
       </w:r>
       <w:r>
         <w:rPr>
-          <w:rFonts w:ascii="Times New Roman" w:hAnsi="Times New Roman"/>
-          <w:sz w:val="24"/>
+          <w:rFonts w:ascii="Consolas" w:hAnsi="Consolas"/>
+          <w:sz w:val="20"/>
         </w:rPr>
         <w:t xml:space="preserve"> </w:t>
       </w:r>
       <w:r>
         <w:rPr>
           <w:rStyle w:val="VerbatimChar"/>
-          <w:rFonts w:ascii="Times New Roman" w:hAnsi="Times New Roman"/>
-          <w:sz w:val="24"/>
+          <w:rFonts w:ascii="Consolas" w:hAnsi="Consolas"/>
+          <w:sz w:val="20"/>
         </w:rPr>
         <w:t xml:space="preserve">countup(-1)</w:t>
       </w:r>
       <w:r>
         <w:rPr>
-          <w:rFonts w:ascii="Times New Roman" w:hAnsi="Times New Roman"/>
-          <w:sz w:val="24"/>
+          <w:rFonts w:ascii="Consolas" w:hAnsi="Consolas"/>
+          <w:sz w:val="20"/>
         </w:rPr>
         <w:t xml:space="preserve">, which prints -1, then</w:t>
       </w:r>
       <w:r>
         <w:rPr>
-          <w:rFonts w:ascii="Times New Roman" w:hAnsi="Times New Roman"/>
-          <w:sz w:val="24"/>
+          <w:rFonts w:ascii="Consolas" w:hAnsi="Consolas"/>
+          <w:sz w:val="20"/>
         </w:rPr>
         <w:t xml:space="preserve"> </w:t>
       </w:r>
       <w:r>
         <w:rPr>
           <w:rStyle w:val="VerbatimChar"/>
-          <w:rFonts w:ascii="Times New Roman" w:hAnsi="Times New Roman"/>
-          <w:sz w:val="24"/>
+          <w:rFonts w:ascii="Consolas" w:hAnsi="Consolas"/>
+          <w:sz w:val="20"/>
         </w:rPr>
         <w:t xml:space="preserve">countup(0)</w:t>
       </w:r>
       <w:r>
         <w:rPr>
-          <w:rFonts w:ascii="Times New Roman" w:hAnsi="Times New Roman"/>
-          <w:sz w:val="24"/>
+          <w:rFonts w:ascii="Consolas" w:hAnsi="Consolas"/>
+          <w:sz w:val="20"/>
         </w:rPr>
         <w:t xml:space="preserve">, which prints 0 and</w:t>
       </w:r>
       <w:r>
         <w:rPr>
-          <w:rFonts w:ascii="Times New Roman" w:hAnsi="Times New Roman"/>
-          <w:sz w:val="24"/>
+          <w:rFonts w:ascii="Consolas" w:hAnsi="Consolas"/>
+          <w:sz w:val="20"/>
         </w:rPr>
         <w:t xml:space="preserve"> </w:t>
       </w:r>
       <w:r>
         <w:rPr>
-          <w:rFonts w:ascii="Times New Roman" w:hAnsi="Times New Roman"/>
-          <w:sz w:val="24"/>
+          <w:rFonts w:ascii="Consolas" w:hAnsi="Consolas"/>
+          <w:sz w:val="20"/>
         </w:rPr>
         <w:t xml:space="preserve">“</w:t>
       </w:r>
       <w:r>
         <w:rPr>
-          <w:rFonts w:ascii="Times New Roman" w:hAnsi="Times New Roman"/>
-          <w:sz w:val="24"/>
+          <w:rFonts w:ascii="Consolas" w:hAnsi="Consolas"/>
+          <w:sz w:val="20"/>
         </w:rPr>
         <w:t xml:space="preserve">Blastoff!</w:t>
       </w:r>
       <w:r>
         <w:rPr>
-          <w:rFonts w:ascii="Times New Roman" w:hAnsi="Times New Roman"/>
-          <w:sz w:val="24"/>
+          <w:rFonts w:ascii="Consolas" w:hAnsi="Consolas"/>
+          <w:sz w:val="20"/>
         </w:rPr>
         <w:t xml:space="preserve">”</w:t>
       </w:r>
       <w:r>
         <w:rPr>
-          <w:rFonts w:ascii="Times New Roman" w:hAnsi="Times New Roman"/>
-          <w:sz w:val="24"/>
+          <w:rFonts w:ascii="Consolas" w:hAnsi="Consolas"/>
+          <w:sz w:val="20"/>
         </w:rPr>
         <w:t xml:space="preserve"> </w:t>
       </w:r>
       <w:r>
         <w:rPr>
-          <w:rFonts w:ascii="Times New Roman" w:hAnsi="Times New Roman"/>
-          <w:sz w:val="24"/>
+          <w:rFonts w:ascii="Consolas" w:hAnsi="Consolas"/>
+          <w:sz w:val="20"/>
         </w:rPr>
         <w:t xml:space="preserve">because it reaches the base case.</w:t>
       </w:r>
@@ -1697,7 +1814,8 @@
     <w:p>
       <w:pPr>
         <w:pStyle w:val="SourceCode"/>
-        <w:spacing w:line="480" w:lineRule="auto"/>
+        <w:spacing w:line="240" w:lineRule="auto"/>
+        <w:ind w:left="720"/>
       </w:pPr>
       <w:r>
         <w:rPr>
@@ -1726,165 +1844,166 @@
     <w:p>
       <w:pPr>
         <w:pStyle w:val="FirstParagraph"/>
-        <w:spacing w:line="480" w:lineRule="auto"/>
-      </w:pPr>
-      <w:r>
-        <w:rPr>
-          <w:rFonts w:ascii="Times New Roman" w:hAnsi="Times New Roman"/>
+        <w:spacing w:line="240" w:lineRule="auto"/>
+        <w:ind w:left="720"/>
+      </w:pPr>
+      <w:r>
+        <w:rPr>
+          <w:rFonts w:ascii="Consolas" w:hAnsi="Consolas"/>
           <w:b/>
           <w:bCs/>
-          <w:sz w:val="24"/>
+          <w:sz w:val="20"/>
         </w:rPr>
         <w:t xml:space="preserve">Explanation</w:t>
       </w:r>
       <w:r>
         <w:rPr>
-          <w:rFonts w:ascii="Times New Roman" w:hAnsi="Times New Roman"/>
-          <w:sz w:val="24"/>
+          <w:rFonts w:ascii="Consolas" w:hAnsi="Consolas"/>
+          <w:sz w:val="20"/>
         </w:rPr>
         <w:t xml:space="preserve">: When the user enters 0, both conditions</w:t>
       </w:r>
       <w:r>
         <w:rPr>
-          <w:rFonts w:ascii="Times New Roman" w:hAnsi="Times New Roman"/>
-          <w:sz w:val="24"/>
+          <w:rFonts w:ascii="Consolas" w:hAnsi="Consolas"/>
+          <w:sz w:val="20"/>
         </w:rPr>
         <w:t xml:space="preserve"> </w:t>
       </w:r>
       <w:r>
         <w:rPr>
           <w:rStyle w:val="VerbatimChar"/>
-          <w:rFonts w:ascii="Times New Roman" w:hAnsi="Times New Roman"/>
-          <w:sz w:val="24"/>
+          <w:rFonts w:ascii="Consolas" w:hAnsi="Consolas"/>
+          <w:sz w:val="20"/>
         </w:rPr>
         <w:t xml:space="preserve">number &gt; 0</w:t>
       </w:r>
       <w:r>
         <w:rPr>
-          <w:rFonts w:ascii="Times New Roman" w:hAnsi="Times New Roman"/>
-          <w:sz w:val="24"/>
+          <w:rFonts w:ascii="Consolas" w:hAnsi="Consolas"/>
+          <w:sz w:val="20"/>
         </w:rPr>
         <w:t xml:space="preserve"> </w:t>
       </w:r>
       <w:r>
         <w:rPr>
-          <w:rFonts w:ascii="Times New Roman" w:hAnsi="Times New Roman"/>
-          <w:sz w:val="24"/>
+          <w:rFonts w:ascii="Consolas" w:hAnsi="Consolas"/>
+          <w:sz w:val="20"/>
         </w:rPr>
         <w:t xml:space="preserve">and</w:t>
       </w:r>
       <w:r>
         <w:rPr>
-          <w:rFonts w:ascii="Times New Roman" w:hAnsi="Times New Roman"/>
-          <w:sz w:val="24"/>
+          <w:rFonts w:ascii="Consolas" w:hAnsi="Consolas"/>
+          <w:sz w:val="20"/>
         </w:rPr>
         <w:t xml:space="preserve"> </w:t>
       </w:r>
       <w:r>
         <w:rPr>
           <w:rStyle w:val="VerbatimChar"/>
-          <w:rFonts w:ascii="Times New Roman" w:hAnsi="Times New Roman"/>
-          <w:sz w:val="24"/>
+          <w:rFonts w:ascii="Consolas" w:hAnsi="Consolas"/>
+          <w:sz w:val="20"/>
         </w:rPr>
         <w:t xml:space="preserve">number &lt; 0</w:t>
       </w:r>
       <w:r>
         <w:rPr>
-          <w:rFonts w:ascii="Times New Roman" w:hAnsi="Times New Roman"/>
-          <w:sz w:val="24"/>
+          <w:rFonts w:ascii="Consolas" w:hAnsi="Consolas"/>
+          <w:sz w:val="20"/>
         </w:rPr>
         <w:t xml:space="preserve"> </w:t>
       </w:r>
       <w:r>
         <w:rPr>
-          <w:rFonts w:ascii="Times New Roman" w:hAnsi="Times New Roman"/>
-          <w:sz w:val="24"/>
+          <w:rFonts w:ascii="Consolas" w:hAnsi="Consolas"/>
+          <w:sz w:val="20"/>
         </w:rPr>
         <w:t xml:space="preserve">evaluate to false, so the else clause executes and calls</w:t>
       </w:r>
       <w:r>
         <w:rPr>
-          <w:rFonts w:ascii="Times New Roman" w:hAnsi="Times New Roman"/>
-          <w:sz w:val="24"/>
+          <w:rFonts w:ascii="Consolas" w:hAnsi="Consolas"/>
+          <w:sz w:val="20"/>
         </w:rPr>
         <w:t xml:space="preserve"> </w:t>
       </w:r>
       <w:r>
         <w:rPr>
           <w:rStyle w:val="VerbatimChar"/>
-          <w:rFonts w:ascii="Times New Roman" w:hAnsi="Times New Roman"/>
-          <w:sz w:val="24"/>
+          <w:rFonts w:ascii="Consolas" w:hAnsi="Consolas"/>
+          <w:sz w:val="20"/>
         </w:rPr>
         <w:t xml:space="preserve">countdown(0)</w:t>
       </w:r>
       <w:r>
         <w:rPr>
-          <w:rFonts w:ascii="Times New Roman" w:hAnsi="Times New Roman"/>
-          <w:sz w:val="24"/>
+          <w:rFonts w:ascii="Consolas" w:hAnsi="Consolas"/>
+          <w:sz w:val="20"/>
         </w:rPr>
         <w:t xml:space="preserve">. Since 0 satisfies the base case condition</w:t>
       </w:r>
       <w:r>
         <w:rPr>
-          <w:rFonts w:ascii="Times New Roman" w:hAnsi="Times New Roman"/>
-          <w:sz w:val="24"/>
+          <w:rFonts w:ascii="Consolas" w:hAnsi="Consolas"/>
+          <w:sz w:val="20"/>
         </w:rPr>
         <w:t xml:space="preserve"> </w:t>
       </w:r>
       <w:r>
         <w:rPr>
           <w:rStyle w:val="VerbatimChar"/>
-          <w:rFonts w:ascii="Times New Roman" w:hAnsi="Times New Roman"/>
-          <w:sz w:val="24"/>
+          <w:rFonts w:ascii="Consolas" w:hAnsi="Consolas"/>
+          <w:sz w:val="20"/>
         </w:rPr>
         <w:t xml:space="preserve">n &lt;= 0</w:t>
       </w:r>
       <w:r>
         <w:rPr>
-          <w:rFonts w:ascii="Times New Roman" w:hAnsi="Times New Roman"/>
-          <w:sz w:val="24"/>
+          <w:rFonts w:ascii="Consolas" w:hAnsi="Consolas"/>
+          <w:sz w:val="20"/>
         </w:rPr>
         <w:t xml:space="preserve">, the function immediately prints</w:t>
       </w:r>
       <w:r>
         <w:rPr>
-          <w:rFonts w:ascii="Times New Roman" w:hAnsi="Times New Roman"/>
-          <w:sz w:val="24"/>
+          <w:rFonts w:ascii="Consolas" w:hAnsi="Consolas"/>
+          <w:sz w:val="20"/>
         </w:rPr>
         <w:t xml:space="preserve"> </w:t>
       </w:r>
       <w:r>
         <w:rPr>
-          <w:rFonts w:ascii="Times New Roman" w:hAnsi="Times New Roman"/>
-          <w:sz w:val="24"/>
+          <w:rFonts w:ascii="Consolas" w:hAnsi="Consolas"/>
+          <w:sz w:val="20"/>
         </w:rPr>
         <w:t xml:space="preserve">“</w:t>
       </w:r>
       <w:r>
         <w:rPr>
-          <w:rFonts w:ascii="Times New Roman" w:hAnsi="Times New Roman"/>
-          <w:sz w:val="24"/>
+          <w:rFonts w:ascii="Consolas" w:hAnsi="Consolas"/>
+          <w:sz w:val="20"/>
         </w:rPr>
         <w:t xml:space="preserve">Blastoff!</w:t>
       </w:r>
       <w:r>
         <w:rPr>
-          <w:rFonts w:ascii="Times New Roman" w:hAnsi="Times New Roman"/>
-          <w:sz w:val="24"/>
+          <w:rFonts w:ascii="Consolas" w:hAnsi="Consolas"/>
+          <w:sz w:val="20"/>
         </w:rPr>
         <w:t xml:space="preserve">”</w:t>
       </w:r>
       <w:r>
         <w:rPr>
-          <w:rFonts w:ascii="Times New Roman" w:hAnsi="Times New Roman"/>
-          <w:sz w:val="24"/>
+          <w:rFonts w:ascii="Consolas" w:hAnsi="Consolas"/>
+          <w:sz w:val="20"/>
         </w:rPr>
         <w:t xml:space="preserve"> </w:t>
       </w:r>
       <w:r>
         <w:rPr>
-          <w:rFonts w:ascii="Times New Roman" w:hAnsi="Times New Roman"/>
-          <w:sz w:val="24"/>
+          <w:rFonts w:ascii="Consolas" w:hAnsi="Consolas"/>
+          <w:sz w:val="20"/>
         </w:rPr>
         <w:t xml:space="preserve">without any recursive calls.</w:t>
       </w:r>
@@ -1907,47 +2026,48 @@
     <w:p>
       <w:pPr>
         <w:pStyle w:val="FirstParagraph"/>
-        <w:spacing w:line="480" w:lineRule="auto"/>
-      </w:pPr>
-      <w:r>
-        <w:rPr>
-          <w:rFonts w:ascii="Times New Roman" w:hAnsi="Times New Roman"/>
-          <w:sz w:val="24"/>
+        <w:spacing w:line="240" w:lineRule="auto"/>
+        <w:ind w:left="720"/>
+      </w:pPr>
+      <w:r>
+        <w:rPr>
+          <w:rFonts w:ascii="Consolas" w:hAnsi="Consolas"/>
+          <w:sz w:val="20"/>
         </w:rPr>
         <w:t xml:space="preserve">I chose to call the countdown function for zero input because zero represents the natural termination point for counting sequences. The countdown function is designed with zero as its base case, making it the most semantically appropriate choice. Additionally, calling countdown(0) provides consistent behavior with the mathematical concept of counting down to zero, where zero is the final number before</w:t>
       </w:r>
       <w:r>
         <w:rPr>
-          <w:rFonts w:ascii="Times New Roman" w:hAnsi="Times New Roman"/>
-          <w:sz w:val="24"/>
+          <w:rFonts w:ascii="Consolas" w:hAnsi="Consolas"/>
+          <w:sz w:val="20"/>
         </w:rPr>
         <w:t xml:space="preserve"> </w:t>
       </w:r>
       <w:r>
         <w:rPr>
-          <w:rFonts w:ascii="Times New Roman" w:hAnsi="Times New Roman"/>
-          <w:sz w:val="24"/>
+          <w:rFonts w:ascii="Consolas" w:hAnsi="Consolas"/>
+          <w:sz w:val="20"/>
         </w:rPr>
         <w:t xml:space="preserve">“</w:t>
       </w:r>
       <w:r>
         <w:rPr>
-          <w:rFonts w:ascii="Times New Roman" w:hAnsi="Times New Roman"/>
-          <w:sz w:val="24"/>
+          <w:rFonts w:ascii="Consolas" w:hAnsi="Consolas"/>
+          <w:sz w:val="20"/>
         </w:rPr>
         <w:t xml:space="preserve">Blastoff!</w:t>
       </w:r>
       <w:r>
         <w:rPr>
-          <w:rFonts w:ascii="Times New Roman" w:hAnsi="Times New Roman"/>
-          <w:sz w:val="24"/>
+          <w:rFonts w:ascii="Consolas" w:hAnsi="Consolas"/>
+          <w:sz w:val="20"/>
         </w:rPr>
         <w:t xml:space="preserve">”</w:t>
       </w:r>
       <w:r>
         <w:rPr>
-          <w:rFonts w:ascii="Times New Roman" w:hAnsi="Times New Roman"/>
-          <w:sz w:val="24"/>
+          <w:rFonts w:ascii="Consolas" w:hAnsi="Consolas"/>
+          <w:sz w:val="20"/>
         </w:rPr>
         <w:t xml:space="preserve">. This design decision ensures that zero is treated as a boundary condition rather than requiring special handling, maintaining code simplicity and logical consistency.</w:t>
       </w:r>
@@ -2003,37 +2123,37 @@
       </w:pPr>
       <w:r>
         <w:rPr>
-          <w:rFonts w:ascii="Consolas" w:hAnsi="Consolas"/>
-          <w:sz w:val="20"/>
+          <w:rFonts w:ascii="Times New Roman" w:hAnsi="Times New Roman"/>
+          <w:sz w:val="24"/>
         </w:rPr>
         <w:t xml:space="preserve">Runtime errors occur during program execution when the interpreter encounters an operation that cannot be completed, such as dividing by zero (Downey, 2015, p. 195). In Python, division by zero raises a</w:t>
       </w:r>
       <w:r>
         <w:rPr>
-          <w:rFonts w:ascii="Consolas" w:hAnsi="Consolas"/>
-          <w:sz w:val="20"/>
+          <w:rFonts w:ascii="Times New Roman" w:hAnsi="Times New Roman"/>
+          <w:sz w:val="24"/>
         </w:rPr>
         <w:t xml:space="preserve"> </w:t>
       </w:r>
       <w:r>
         <w:rPr>
           <w:rStyle w:val="VerbatimChar"/>
-          <w:rFonts w:ascii="Consolas" w:hAnsi="Consolas"/>
-          <w:sz w:val="20"/>
+          <w:rFonts w:ascii="Times New Roman" w:hAnsi="Times New Roman"/>
+          <w:sz w:val="24"/>
         </w:rPr>
         <w:t xml:space="preserve">ZeroDivisionError</w:t>
       </w:r>
       <w:r>
         <w:rPr>
-          <w:rFonts w:ascii="Consolas" w:hAnsi="Consolas"/>
-          <w:sz w:val="20"/>
+          <w:rFonts w:ascii="Times New Roman" w:hAnsi="Times New Roman"/>
+          <w:sz w:val="24"/>
         </w:rPr>
         <w:t xml:space="preserve"> </w:t>
       </w:r>
       <w:r>
         <w:rPr>
-          <w:rFonts w:ascii="Consolas" w:hAnsi="Consolas"/>
-          <w:sz w:val="20"/>
+          <w:rFonts w:ascii="Times New Roman" w:hAnsi="Times New Roman"/>
+          <w:sz w:val="24"/>
         </w:rPr>
         <w:t xml:space="preserve">exception, which immediately terminates the program unless handled properly. Exception handling using try-except blocks allows programs to anticipate and gracefully manage runtime errors by providing alternative code paths when errors occur (Bro Code, 2024).</w:t>
       </w:r>
@@ -2082,13 +2202,15 @@
     <w:p>
       <w:pPr>
         <w:pStyle w:val="SourceCode"/>
-        <w:spacing w:line="480" w:lineRule="auto"/>
+        <w:spacing w:line="240" w:lineRule="auto"/>
+        <w:ind w:left="720"/>
       </w:pPr>
       <w:r>
         <w:rPr>
           <w:rStyle w:val="KeywordTok"/>
           <w:rFonts w:ascii="Consolas" w:hAnsi="Consolas"/>
           <w:sz w:val="20"/>
+          <w:shd w:fill="F5F5F5"/>
         </w:rPr>
         <w:t xml:space="preserve">def</w:t>
       </w:r>
@@ -2097,6 +2219,7 @@
           <w:rStyle w:val="NormalTok"/>
           <w:rFonts w:ascii="Consolas" w:hAnsi="Consolas"/>
           <w:sz w:val="20"/>
+          <w:shd w:fill="F5F5F5"/>
         </w:rPr>
         <w:t xml:space="preserve"> divide_without_handling():</w:t>
       </w:r>
@@ -2104,14 +2227,16 @@
         <w:rPr>
           <w:rFonts w:ascii="Consolas" w:hAnsi="Consolas"/>
           <w:sz w:val="20"/>
-        </w:rPr>
-        <w:br/>
-      </w:r>
-      <w:r>
-        <w:rPr>
-          <w:rStyle w:val="NormalTok"/>
-          <w:rFonts w:ascii="Consolas" w:hAnsi="Consolas"/>
-          <w:sz w:val="20"/>
+          <w:shd w:fill="F5F5F5"/>
+        </w:rPr>
+        <w:br/>
+      </w:r>
+      <w:r>
+        <w:rPr>
+          <w:rStyle w:val="NormalTok"/>
+          <w:rFonts w:ascii="Consolas" w:hAnsi="Consolas"/>
+          <w:sz w:val="20"/>
+          <w:shd w:fill="F5F5F5"/>
         </w:rPr>
         <w:t xml:space="preserve">    </w:t>
       </w:r>
@@ -2120,6 +2245,7 @@
           <w:rStyle w:val="CommentTok"/>
           <w:rFonts w:ascii="Consolas" w:hAnsi="Consolas"/>
           <w:sz w:val="20"/>
+          <w:shd w:fill="F5F5F5"/>
         </w:rPr>
         <w:t xml:space="preserve">"""Division program without error handling - demonstrates runtime error."""</w:t>
       </w:r>
@@ -2127,14 +2253,16 @@
         <w:rPr>
           <w:rFonts w:ascii="Consolas" w:hAnsi="Consolas"/>
           <w:sz w:val="20"/>
-        </w:rPr>
-        <w:br/>
-      </w:r>
-      <w:r>
-        <w:rPr>
-          <w:rStyle w:val="NormalTok"/>
-          <w:rFonts w:ascii="Consolas" w:hAnsi="Consolas"/>
-          <w:sz w:val="20"/>
+          <w:shd w:fill="F5F5F5"/>
+        </w:rPr>
+        <w:br/>
+      </w:r>
+      <w:r>
+        <w:rPr>
+          <w:rStyle w:val="NormalTok"/>
+          <w:rFonts w:ascii="Consolas" w:hAnsi="Consolas"/>
+          <w:sz w:val="20"/>
+          <w:shd w:fill="F5F5F5"/>
         </w:rPr>
         <w:t xml:space="preserve">    </w:t>
       </w:r>
@@ -2143,6 +2271,7 @@
           <w:rStyle w:val="BuiltInTok"/>
           <w:rFonts w:ascii="Consolas" w:hAnsi="Consolas"/>
           <w:sz w:val="20"/>
+          <w:shd w:fill="F5F5F5"/>
         </w:rPr>
         <w:t xml:space="preserve">print</w:t>
       </w:r>
@@ -2151,6 +2280,7 @@
           <w:rStyle w:val="NormalTok"/>
           <w:rFonts w:ascii="Consolas" w:hAnsi="Consolas"/>
           <w:sz w:val="20"/>
+          <w:shd w:fill="F5F5F5"/>
         </w:rPr>
         <w:t xml:space="preserve">(</w:t>
       </w:r>
@@ -2159,6 +2289,7 @@
           <w:rStyle w:val="StringTok"/>
           <w:rFonts w:ascii="Consolas" w:hAnsi="Consolas"/>
           <w:sz w:val="20"/>
+          <w:shd w:fill="F5F5F5"/>
         </w:rPr>
         <w:t xml:space="preserve">"=== Division Program (Without Error Handling) ==="</w:t>
       </w:r>
@@ -2167,6 +2298,7 @@
           <w:rStyle w:val="NormalTok"/>
           <w:rFonts w:ascii="Consolas" w:hAnsi="Consolas"/>
           <w:sz w:val="20"/>
+          <w:shd w:fill="F5F5F5"/>
         </w:rPr>
         <w:t xml:space="preserve">)</w:t>
       </w:r>
@@ -2174,14 +2306,16 @@
         <w:rPr>
           <w:rFonts w:ascii="Consolas" w:hAnsi="Consolas"/>
           <w:sz w:val="20"/>
-        </w:rPr>
-        <w:br/>
-      </w:r>
-      <w:r>
-        <w:rPr>
-          <w:rStyle w:val="NormalTok"/>
-          <w:rFonts w:ascii="Consolas" w:hAnsi="Consolas"/>
-          <w:sz w:val="20"/>
+          <w:shd w:fill="F5F5F5"/>
+        </w:rPr>
+        <w:br/>
+      </w:r>
+      <w:r>
+        <w:rPr>
+          <w:rStyle w:val="NormalTok"/>
+          <w:rFonts w:ascii="Consolas" w:hAnsi="Consolas"/>
+          <w:sz w:val="20"/>
+          <w:shd w:fill="F5F5F5"/>
         </w:rPr>
         <w:t xml:space="preserve">    num1 </w:t>
       </w:r>
@@ -2190,6 +2324,7 @@
           <w:rStyle w:val="OperatorTok"/>
           <w:rFonts w:ascii="Consolas" w:hAnsi="Consolas"/>
           <w:sz w:val="20"/>
+          <w:shd w:fill="F5F5F5"/>
         </w:rPr>
         <w:t xml:space="preserve">=</w:t>
       </w:r>
@@ -2198,6 +2333,7 @@
           <w:rStyle w:val="NormalTok"/>
           <w:rFonts w:ascii="Consolas" w:hAnsi="Consolas"/>
           <w:sz w:val="20"/>
+          <w:shd w:fill="F5F5F5"/>
         </w:rPr>
         <w:t xml:space="preserve"> </w:t>
       </w:r>
@@ -2206,6 +2342,7 @@
           <w:rStyle w:val="BuiltInTok"/>
           <w:rFonts w:ascii="Consolas" w:hAnsi="Consolas"/>
           <w:sz w:val="20"/>
+          <w:shd w:fill="F5F5F5"/>
         </w:rPr>
         <w:t xml:space="preserve">float</w:t>
       </w:r>
@@ -2214,6 +2351,7 @@
           <w:rStyle w:val="NormalTok"/>
           <w:rFonts w:ascii="Consolas" w:hAnsi="Consolas"/>
           <w:sz w:val="20"/>
+          <w:shd w:fill="F5F5F5"/>
         </w:rPr>
         <w:t xml:space="preserve">(</w:t>
       </w:r>
@@ -2222,6 +2360,7 @@
           <w:rStyle w:val="BuiltInTok"/>
           <w:rFonts w:ascii="Consolas" w:hAnsi="Consolas"/>
           <w:sz w:val="20"/>
+          <w:shd w:fill="F5F5F5"/>
         </w:rPr>
         <w:t xml:space="preserve">input</w:t>
       </w:r>
@@ -2230,6 +2369,7 @@
           <w:rStyle w:val="NormalTok"/>
           <w:rFonts w:ascii="Consolas" w:hAnsi="Consolas"/>
           <w:sz w:val="20"/>
+          <w:shd w:fill="F5F5F5"/>
         </w:rPr>
         <w:t xml:space="preserve">(</w:t>
       </w:r>
@@ -2238,6 +2378,7 @@
           <w:rStyle w:val="StringTok"/>
           <w:rFonts w:ascii="Consolas" w:hAnsi="Consolas"/>
           <w:sz w:val="20"/>
+          <w:shd w:fill="F5F5F5"/>
         </w:rPr>
         <w:t xml:space="preserve">"Enter the first number (numerator): "</w:t>
       </w:r>
@@ -2246,6 +2387,7 @@
           <w:rStyle w:val="NormalTok"/>
           <w:rFonts w:ascii="Consolas" w:hAnsi="Consolas"/>
           <w:sz w:val="20"/>
+          <w:shd w:fill="F5F5F5"/>
         </w:rPr>
         <w:t xml:space="preserve">))</w:t>
       </w:r>
@@ -2253,14 +2395,16 @@
         <w:rPr>
           <w:rFonts w:ascii="Consolas" w:hAnsi="Consolas"/>
           <w:sz w:val="20"/>
-        </w:rPr>
-        <w:br/>
-      </w:r>
-      <w:r>
-        <w:rPr>
-          <w:rStyle w:val="NormalTok"/>
-          <w:rFonts w:ascii="Consolas" w:hAnsi="Consolas"/>
-          <w:sz w:val="20"/>
+          <w:shd w:fill="F5F5F5"/>
+        </w:rPr>
+        <w:br/>
+      </w:r>
+      <w:r>
+        <w:rPr>
+          <w:rStyle w:val="NormalTok"/>
+          <w:rFonts w:ascii="Consolas" w:hAnsi="Consolas"/>
+          <w:sz w:val="20"/>
+          <w:shd w:fill="F5F5F5"/>
         </w:rPr>
         <w:t xml:space="preserve">    num2 </w:t>
       </w:r>
@@ -2269,6 +2413,7 @@
           <w:rStyle w:val="OperatorTok"/>
           <w:rFonts w:ascii="Consolas" w:hAnsi="Consolas"/>
           <w:sz w:val="20"/>
+          <w:shd w:fill="F5F5F5"/>
         </w:rPr>
         <w:t xml:space="preserve">=</w:t>
       </w:r>
@@ -2277,6 +2422,7 @@
           <w:rStyle w:val="NormalTok"/>
           <w:rFonts w:ascii="Consolas" w:hAnsi="Consolas"/>
           <w:sz w:val="20"/>
+          <w:shd w:fill="F5F5F5"/>
         </w:rPr>
         <w:t xml:space="preserve"> </w:t>
       </w:r>
@@ -2285,6 +2431,7 @@
           <w:rStyle w:val="BuiltInTok"/>
           <w:rFonts w:ascii="Consolas" w:hAnsi="Consolas"/>
           <w:sz w:val="20"/>
+          <w:shd w:fill="F5F5F5"/>
         </w:rPr>
         <w:t xml:space="preserve">float</w:t>
       </w:r>
@@ -2293,6 +2440,7 @@
           <w:rStyle w:val="NormalTok"/>
           <w:rFonts w:ascii="Consolas" w:hAnsi="Consolas"/>
           <w:sz w:val="20"/>
+          <w:shd w:fill="F5F5F5"/>
         </w:rPr>
         <w:t xml:space="preserve">(</w:t>
       </w:r>
@@ -2301,6 +2449,7 @@
           <w:rStyle w:val="BuiltInTok"/>
           <w:rFonts w:ascii="Consolas" w:hAnsi="Consolas"/>
           <w:sz w:val="20"/>
+          <w:shd w:fill="F5F5F5"/>
         </w:rPr>
         <w:t xml:space="preserve">input</w:t>
       </w:r>
@@ -2309,6 +2458,7 @@
           <w:rStyle w:val="NormalTok"/>
           <w:rFonts w:ascii="Consolas" w:hAnsi="Consolas"/>
           <w:sz w:val="20"/>
+          <w:shd w:fill="F5F5F5"/>
         </w:rPr>
         <w:t xml:space="preserve">(</w:t>
       </w:r>
@@ -2317,6 +2467,7 @@
           <w:rStyle w:val="StringTok"/>
           <w:rFonts w:ascii="Consolas" w:hAnsi="Consolas"/>
           <w:sz w:val="20"/>
+          <w:shd w:fill="F5F5F5"/>
         </w:rPr>
         <w:t xml:space="preserve">"Enter the second number (denominator): "</w:t>
       </w:r>
@@ -2325,6 +2476,7 @@
           <w:rStyle w:val="NormalTok"/>
           <w:rFonts w:ascii="Consolas" w:hAnsi="Consolas"/>
           <w:sz w:val="20"/>
+          <w:shd w:fill="F5F5F5"/>
         </w:rPr>
         <w:t xml:space="preserve">))</w:t>
       </w:r>
@@ -2332,14 +2484,16 @@
         <w:rPr>
           <w:rFonts w:ascii="Consolas" w:hAnsi="Consolas"/>
           <w:sz w:val="20"/>
-        </w:rPr>
-        <w:br/>
-      </w:r>
-      <w:r>
-        <w:rPr>
-          <w:rStyle w:val="NormalTok"/>
-          <w:rFonts w:ascii="Consolas" w:hAnsi="Consolas"/>
-          <w:sz w:val="20"/>
+          <w:shd w:fill="F5F5F5"/>
+        </w:rPr>
+        <w:br/>
+      </w:r>
+      <w:r>
+        <w:rPr>
+          <w:rStyle w:val="NormalTok"/>
+          <w:rFonts w:ascii="Consolas" w:hAnsi="Consolas"/>
+          <w:sz w:val="20"/>
+          <w:shd w:fill="F5F5F5"/>
         </w:rPr>
         <w:t xml:space="preserve">    </w:t>
       </w:r>
@@ -2347,14 +2501,16 @@
         <w:rPr>
           <w:rFonts w:ascii="Consolas" w:hAnsi="Consolas"/>
           <w:sz w:val="20"/>
-        </w:rPr>
-        <w:br/>
-      </w:r>
-      <w:r>
-        <w:rPr>
-          <w:rStyle w:val="NormalTok"/>
-          <w:rFonts w:ascii="Consolas" w:hAnsi="Consolas"/>
-          <w:sz w:val="20"/>
+          <w:shd w:fill="F5F5F5"/>
+        </w:rPr>
+        <w:br/>
+      </w:r>
+      <w:r>
+        <w:rPr>
+          <w:rStyle w:val="NormalTok"/>
+          <w:rFonts w:ascii="Consolas" w:hAnsi="Consolas"/>
+          <w:sz w:val="20"/>
+          <w:shd w:fill="F5F5F5"/>
         </w:rPr>
         <w:t xml:space="preserve">    result </w:t>
       </w:r>
@@ -2363,6 +2519,7 @@
           <w:rStyle w:val="OperatorTok"/>
           <w:rFonts w:ascii="Consolas" w:hAnsi="Consolas"/>
           <w:sz w:val="20"/>
+          <w:shd w:fill="F5F5F5"/>
         </w:rPr>
         <w:t xml:space="preserve">=</w:t>
       </w:r>
@@ -2371,6 +2528,7 @@
           <w:rStyle w:val="NormalTok"/>
           <w:rFonts w:ascii="Consolas" w:hAnsi="Consolas"/>
           <w:sz w:val="20"/>
+          <w:shd w:fill="F5F5F5"/>
         </w:rPr>
         <w:t xml:space="preserve"> num1 </w:t>
       </w:r>
@@ -2379,6 +2537,7 @@
           <w:rStyle w:val="OperatorTok"/>
           <w:rFonts w:ascii="Consolas" w:hAnsi="Consolas"/>
           <w:sz w:val="20"/>
+          <w:shd w:fill="F5F5F5"/>
         </w:rPr>
         <w:t xml:space="preserve">/</w:t>
       </w:r>
@@ -2387,6 +2546,7 @@
           <w:rStyle w:val="NormalTok"/>
           <w:rFonts w:ascii="Consolas" w:hAnsi="Consolas"/>
           <w:sz w:val="20"/>
+          <w:shd w:fill="F5F5F5"/>
         </w:rPr>
         <w:t xml:space="preserve"> num2</w:t>
       </w:r>
@@ -2394,14 +2554,16 @@
         <w:rPr>
           <w:rFonts w:ascii="Consolas" w:hAnsi="Consolas"/>
           <w:sz w:val="20"/>
-        </w:rPr>
-        <w:br/>
-      </w:r>
-      <w:r>
-        <w:rPr>
-          <w:rStyle w:val="NormalTok"/>
-          <w:rFonts w:ascii="Consolas" w:hAnsi="Consolas"/>
-          <w:sz w:val="20"/>
+          <w:shd w:fill="F5F5F5"/>
+        </w:rPr>
+        <w:br/>
+      </w:r>
+      <w:r>
+        <w:rPr>
+          <w:rStyle w:val="NormalTok"/>
+          <w:rFonts w:ascii="Consolas" w:hAnsi="Consolas"/>
+          <w:sz w:val="20"/>
+          <w:shd w:fill="F5F5F5"/>
         </w:rPr>
         <w:t xml:space="preserve">    </w:t>
       </w:r>
@@ -2410,6 +2572,7 @@
           <w:rStyle w:val="BuiltInTok"/>
           <w:rFonts w:ascii="Consolas" w:hAnsi="Consolas"/>
           <w:sz w:val="20"/>
+          <w:shd w:fill="F5F5F5"/>
         </w:rPr>
         <w:t xml:space="preserve">print</w:t>
       </w:r>
@@ -2418,6 +2581,7 @@
           <w:rStyle w:val="NormalTok"/>
           <w:rFonts w:ascii="Consolas" w:hAnsi="Consolas"/>
           <w:sz w:val="20"/>
+          <w:shd w:fill="F5F5F5"/>
         </w:rPr>
         <w:t xml:space="preserve">(</w:t>
       </w:r>
@@ -2426,6 +2590,7 @@
           <w:rStyle w:val="SpecialStringTok"/>
           <w:rFonts w:ascii="Consolas" w:hAnsi="Consolas"/>
           <w:sz w:val="20"/>
+          <w:shd w:fill="F5F5F5"/>
         </w:rPr>
         <w:t xml:space="preserve">f"Result: </w:t>
       </w:r>
@@ -2434,6 +2599,7 @@
           <w:rStyle w:val="SpecialCharTok"/>
           <w:rFonts w:ascii="Consolas" w:hAnsi="Consolas"/>
           <w:sz w:val="20"/>
+          <w:shd w:fill="F5F5F5"/>
         </w:rPr>
         <w:t xml:space="preserve">{</w:t>
       </w:r>
@@ -2442,6 +2608,7 @@
           <w:rStyle w:val="NormalTok"/>
           <w:rFonts w:ascii="Consolas" w:hAnsi="Consolas"/>
           <w:sz w:val="20"/>
+          <w:shd w:fill="F5F5F5"/>
         </w:rPr>
         <w:t xml:space="preserve">num1</w:t>
       </w:r>
@@ -2450,6 +2617,7 @@
           <w:rStyle w:val="SpecialCharTok"/>
           <w:rFonts w:ascii="Consolas" w:hAnsi="Consolas"/>
           <w:sz w:val="20"/>
+          <w:shd w:fill="F5F5F5"/>
         </w:rPr>
         <w:t xml:space="preserve">}</w:t>
       </w:r>
@@ -2458,6 +2626,7 @@
           <w:rStyle w:val="SpecialStringTok"/>
           <w:rFonts w:ascii="Consolas" w:hAnsi="Consolas"/>
           <w:sz w:val="20"/>
+          <w:shd w:fill="F5F5F5"/>
         </w:rPr>
         <w:t xml:space="preserve"> / </w:t>
       </w:r>
@@ -2466,6 +2635,7 @@
           <w:rStyle w:val="SpecialCharTok"/>
           <w:rFonts w:ascii="Consolas" w:hAnsi="Consolas"/>
           <w:sz w:val="20"/>
+          <w:shd w:fill="F5F5F5"/>
         </w:rPr>
         <w:t xml:space="preserve">{</w:t>
       </w:r>
@@ -2474,6 +2644,7 @@
           <w:rStyle w:val="NormalTok"/>
           <w:rFonts w:ascii="Consolas" w:hAnsi="Consolas"/>
           <w:sz w:val="20"/>
+          <w:shd w:fill="F5F5F5"/>
         </w:rPr>
         <w:t xml:space="preserve">num2</w:t>
       </w:r>
@@ -2482,6 +2653,7 @@
           <w:rStyle w:val="SpecialCharTok"/>
           <w:rFonts w:ascii="Consolas" w:hAnsi="Consolas"/>
           <w:sz w:val="20"/>
+          <w:shd w:fill="F5F5F5"/>
         </w:rPr>
         <w:t xml:space="preserve">}</w:t>
       </w:r>
@@ -2490,6 +2662,7 @@
           <w:rStyle w:val="SpecialStringTok"/>
           <w:rFonts w:ascii="Consolas" w:hAnsi="Consolas"/>
           <w:sz w:val="20"/>
+          <w:shd w:fill="F5F5F5"/>
         </w:rPr>
         <w:t xml:space="preserve"> = </w:t>
       </w:r>
@@ -2498,6 +2671,7 @@
           <w:rStyle w:val="SpecialCharTok"/>
           <w:rFonts w:ascii="Consolas" w:hAnsi="Consolas"/>
           <w:sz w:val="20"/>
+          <w:shd w:fill="F5F5F5"/>
         </w:rPr>
         <w:t xml:space="preserve">{</w:t>
       </w:r>
@@ -2506,6 +2680,7 @@
           <w:rStyle w:val="NormalTok"/>
           <w:rFonts w:ascii="Consolas" w:hAnsi="Consolas"/>
           <w:sz w:val="20"/>
+          <w:shd w:fill="F5F5F5"/>
         </w:rPr>
         <w:t xml:space="preserve">result</w:t>
       </w:r>
@@ -2514,6 +2689,7 @@
           <w:rStyle w:val="SpecialCharTok"/>
           <w:rFonts w:ascii="Consolas" w:hAnsi="Consolas"/>
           <w:sz w:val="20"/>
+          <w:shd w:fill="F5F5F5"/>
         </w:rPr>
         <w:t xml:space="preserve">}</w:t>
       </w:r>
@@ -2522,6 +2698,7 @@
           <w:rStyle w:val="SpecialStringTok"/>
           <w:rFonts w:ascii="Consolas" w:hAnsi="Consolas"/>
           <w:sz w:val="20"/>
+          <w:shd w:fill="F5F5F5"/>
         </w:rPr>
         <w:t xml:space="preserve">"</w:t>
       </w:r>
@@ -2530,6 +2707,7 @@
           <w:rStyle w:val="NormalTok"/>
           <w:rFonts w:ascii="Consolas" w:hAnsi="Consolas"/>
           <w:sz w:val="20"/>
+          <w:shd w:fill="F5F5F5"/>
         </w:rPr>
         <w:t xml:space="preserve">)</w:t>
       </w:r>
@@ -2537,13 +2715,15 @@
         <w:rPr>
           <w:rFonts w:ascii="Consolas" w:hAnsi="Consolas"/>
           <w:sz w:val="20"/>
-        </w:rPr>
-        <w:br/>
-      </w:r>
-      <w:r>
-        <w:rPr>
-          <w:rFonts w:ascii="Consolas" w:hAnsi="Consolas"/>
-          <w:sz w:val="20"/>
+          <w:shd w:fill="F5F5F5"/>
+        </w:rPr>
+        <w:br/>
+      </w:r>
+      <w:r>
+        <w:rPr>
+          <w:rFonts w:ascii="Consolas" w:hAnsi="Consolas"/>
+          <w:sz w:val="20"/>
+          <w:shd w:fill="F5F5F5"/>
         </w:rPr>
         <w:br/>
       </w:r>
@@ -2552,6 +2732,7 @@
           <w:rStyle w:val="CommentTok"/>
           <w:rFonts w:ascii="Consolas" w:hAnsi="Consolas"/>
           <w:sz w:val="20"/>
+          <w:shd w:fill="F5F5F5"/>
         </w:rPr>
         <w:t xml:space="preserve"># Uncomment to test runtime error</w:t>
       </w:r>
@@ -2559,6 +2740,7 @@
         <w:rPr>
           <w:rFonts w:ascii="Consolas" w:hAnsi="Consolas"/>
           <w:sz w:val="20"/>
+          <w:shd w:fill="F5F5F5"/>
         </w:rPr>
         <w:br/>
       </w:r>
@@ -2567,6 +2749,7 @@
           <w:rStyle w:val="CommentTok"/>
           <w:rFonts w:ascii="Consolas" w:hAnsi="Consolas"/>
           <w:sz w:val="20"/>
+          <w:shd w:fill="F5F5F5"/>
         </w:rPr>
         <w:t xml:space="preserve"># divide_without_handling()</w:t>
       </w:r>
@@ -2589,7 +2772,8 @@
     <w:p>
       <w:pPr>
         <w:pStyle w:val="SourceCode"/>
-        <w:spacing w:line="480" w:lineRule="auto"/>
+        <w:spacing w:line="240" w:lineRule="auto"/>
+        <w:ind w:left="720"/>
       </w:pPr>
       <w:r>
         <w:rPr>
@@ -2697,97 +2881,97 @@
       </w:pPr>
       <w:r>
         <w:rPr>
-          <w:rFonts w:ascii="Consolas" w:hAnsi="Consolas"/>
+          <w:rFonts w:ascii="Times New Roman" w:hAnsi="Times New Roman"/>
           <w:b/>
           <w:bCs/>
-          <w:sz w:val="20"/>
+          <w:sz w:val="24"/>
         </w:rPr>
         <w:t xml:space="preserve">Error Analysis</w:t>
       </w:r>
       <w:r>
         <w:rPr>
-          <w:rFonts w:ascii="Consolas" w:hAnsi="Consolas"/>
-          <w:sz w:val="20"/>
+          <w:rFonts w:ascii="Times New Roman" w:hAnsi="Times New Roman"/>
+          <w:sz w:val="24"/>
         </w:rPr>
         <w:t xml:space="preserve">: The runtime error occurs at line 6 when the program attempts to execute</w:t>
       </w:r>
       <w:r>
         <w:rPr>
-          <w:rFonts w:ascii="Consolas" w:hAnsi="Consolas"/>
-          <w:sz w:val="20"/>
+          <w:rFonts w:ascii="Times New Roman" w:hAnsi="Times New Roman"/>
+          <w:sz w:val="24"/>
         </w:rPr>
         <w:t xml:space="preserve"> </w:t>
       </w:r>
       <w:r>
         <w:rPr>
           <w:rStyle w:val="VerbatimChar"/>
-          <w:rFonts w:ascii="Consolas" w:hAnsi="Consolas"/>
-          <w:sz w:val="20"/>
+          <w:rFonts w:ascii="Times New Roman" w:hAnsi="Times New Roman"/>
+          <w:sz w:val="24"/>
         </w:rPr>
         <w:t xml:space="preserve">num1 / num2</w:t>
       </w:r>
       <w:r>
         <w:rPr>
-          <w:rFonts w:ascii="Consolas" w:hAnsi="Consolas"/>
-          <w:sz w:val="20"/>
+          <w:rFonts w:ascii="Times New Roman" w:hAnsi="Times New Roman"/>
+          <w:sz w:val="24"/>
         </w:rPr>
         <w:t xml:space="preserve"> </w:t>
       </w:r>
       <w:r>
         <w:rPr>
-          <w:rFonts w:ascii="Consolas" w:hAnsi="Consolas"/>
-          <w:sz w:val="20"/>
+          <w:rFonts w:ascii="Times New Roman" w:hAnsi="Times New Roman"/>
+          <w:sz w:val="24"/>
         </w:rPr>
         <w:t xml:space="preserve">with</w:t>
       </w:r>
       <w:r>
         <w:rPr>
-          <w:rFonts w:ascii="Consolas" w:hAnsi="Consolas"/>
-          <w:sz w:val="20"/>
+          <w:rFonts w:ascii="Times New Roman" w:hAnsi="Times New Roman"/>
+          <w:sz w:val="24"/>
         </w:rPr>
         <w:t xml:space="preserve"> </w:t>
       </w:r>
       <w:r>
         <w:rPr>
           <w:rStyle w:val="VerbatimChar"/>
-          <w:rFonts w:ascii="Consolas" w:hAnsi="Consolas"/>
-          <w:sz w:val="20"/>
+          <w:rFonts w:ascii="Times New Roman" w:hAnsi="Times New Roman"/>
+          <w:sz w:val="24"/>
         </w:rPr>
         <w:t xml:space="preserve">num2 = 0</w:t>
       </w:r>
       <w:r>
         <w:rPr>
-          <w:rFonts w:ascii="Consolas" w:hAnsi="Consolas"/>
-          <w:sz w:val="20"/>
+          <w:rFonts w:ascii="Times New Roman" w:hAnsi="Times New Roman"/>
+          <w:sz w:val="24"/>
         </w:rPr>
         <w:t xml:space="preserve">. Python raises a</w:t>
       </w:r>
       <w:r>
         <w:rPr>
-          <w:rFonts w:ascii="Consolas" w:hAnsi="Consolas"/>
-          <w:sz w:val="20"/>
+          <w:rFonts w:ascii="Times New Roman" w:hAnsi="Times New Roman"/>
+          <w:sz w:val="24"/>
         </w:rPr>
         <w:t xml:space="preserve"> </w:t>
       </w:r>
       <w:r>
         <w:rPr>
           <w:rStyle w:val="VerbatimChar"/>
-          <w:rFonts w:ascii="Consolas" w:hAnsi="Consolas"/>
-          <w:sz w:val="20"/>
+          <w:rFonts w:ascii="Times New Roman" w:hAnsi="Times New Roman"/>
+          <w:sz w:val="24"/>
         </w:rPr>
         <w:t xml:space="preserve">ZeroDivisionError</w:t>
       </w:r>
       <w:r>
         <w:rPr>
-          <w:rFonts w:ascii="Consolas" w:hAnsi="Consolas"/>
-          <w:sz w:val="20"/>
+          <w:rFonts w:ascii="Times New Roman" w:hAnsi="Times New Roman"/>
+          <w:sz w:val="24"/>
         </w:rPr>
         <w:t xml:space="preserve"> </w:t>
       </w:r>
       <w:r>
         <w:rPr>
-          <w:rFonts w:ascii="Consolas" w:hAnsi="Consolas"/>
-          <w:sz w:val="20"/>
+          <w:rFonts w:ascii="Times New Roman" w:hAnsi="Times New Roman"/>
+          <w:sz w:val="24"/>
         </w:rPr>
         <w:t xml:space="preserve">exception because division by zero is mathematically undefined. The traceback shows the exact location of the error, the function name, and the specific exception type, providing developers with diagnostic information to identify and fix the issue.</w:t>
       </w:r>
@@ -2810,13 +2994,15 @@
     <w:p>
       <w:pPr>
         <w:pStyle w:val="SourceCode"/>
-        <w:spacing w:line="480" w:lineRule="auto"/>
+        <w:spacing w:line="240" w:lineRule="auto"/>
+        <w:ind w:left="720"/>
       </w:pPr>
       <w:r>
         <w:rPr>
           <w:rStyle w:val="KeywordTok"/>
           <w:rFonts w:ascii="Consolas" w:hAnsi="Consolas"/>
           <w:sz w:val="20"/>
+          <w:shd w:fill="F5F5F5"/>
         </w:rPr>
         <w:t xml:space="preserve">def</w:t>
       </w:r>
@@ -2825,6 +3011,7 @@
           <w:rStyle w:val="NormalTok"/>
           <w:rFonts w:ascii="Consolas" w:hAnsi="Consolas"/>
           <w:sz w:val="20"/>
+          <w:shd w:fill="F5F5F5"/>
         </w:rPr>
         <w:t xml:space="preserve"> divide_with_handling():</w:t>
       </w:r>
@@ -2832,14 +3019,16 @@
         <w:rPr>
           <w:rFonts w:ascii="Consolas" w:hAnsi="Consolas"/>
           <w:sz w:val="20"/>
-        </w:rPr>
-        <w:br/>
-      </w:r>
-      <w:r>
-        <w:rPr>
-          <w:rStyle w:val="NormalTok"/>
-          <w:rFonts w:ascii="Consolas" w:hAnsi="Consolas"/>
-          <w:sz w:val="20"/>
+          <w:shd w:fill="F5F5F5"/>
+        </w:rPr>
+        <w:br/>
+      </w:r>
+      <w:r>
+        <w:rPr>
+          <w:rStyle w:val="NormalTok"/>
+          <w:rFonts w:ascii="Consolas" w:hAnsi="Consolas"/>
+          <w:sz w:val="20"/>
+          <w:shd w:fill="F5F5F5"/>
         </w:rPr>
         <w:t xml:space="preserve">    </w:t>
       </w:r>
@@ -2848,6 +3037,7 @@
           <w:rStyle w:val="CommentTok"/>
           <w:rFonts w:ascii="Consolas" w:hAnsi="Consolas"/>
           <w:sz w:val="20"/>
+          <w:shd w:fill="F5F5F5"/>
         </w:rPr>
         <w:t xml:space="preserve">"""Division program with proper error handling."""</w:t>
       </w:r>
@@ -2855,14 +3045,16 @@
         <w:rPr>
           <w:rFonts w:ascii="Consolas" w:hAnsi="Consolas"/>
           <w:sz w:val="20"/>
-        </w:rPr>
-        <w:br/>
-      </w:r>
-      <w:r>
-        <w:rPr>
-          <w:rStyle w:val="NormalTok"/>
-          <w:rFonts w:ascii="Consolas" w:hAnsi="Consolas"/>
-          <w:sz w:val="20"/>
+          <w:shd w:fill="F5F5F5"/>
+        </w:rPr>
+        <w:br/>
+      </w:r>
+      <w:r>
+        <w:rPr>
+          <w:rStyle w:val="NormalTok"/>
+          <w:rFonts w:ascii="Consolas" w:hAnsi="Consolas"/>
+          <w:sz w:val="20"/>
+          <w:shd w:fill="F5F5F5"/>
         </w:rPr>
         <w:t xml:space="preserve">    </w:t>
       </w:r>
@@ -2871,6 +3063,7 @@
           <w:rStyle w:val="BuiltInTok"/>
           <w:rFonts w:ascii="Consolas" w:hAnsi="Consolas"/>
           <w:sz w:val="20"/>
+          <w:shd w:fill="F5F5F5"/>
         </w:rPr>
         <w:t xml:space="preserve">print</w:t>
       </w:r>
@@ -2879,6 +3072,7 @@
           <w:rStyle w:val="NormalTok"/>
           <w:rFonts w:ascii="Consolas" w:hAnsi="Consolas"/>
           <w:sz w:val="20"/>
+          <w:shd w:fill="F5F5F5"/>
         </w:rPr>
         <w:t xml:space="preserve">(</w:t>
       </w:r>
@@ -2887,6 +3081,7 @@
           <w:rStyle w:val="StringTok"/>
           <w:rFonts w:ascii="Consolas" w:hAnsi="Consolas"/>
           <w:sz w:val="20"/>
+          <w:shd w:fill="F5F5F5"/>
         </w:rPr>
         <w:t xml:space="preserve">"=== Division Program (With Error Handling) ==="</w:t>
       </w:r>
@@ -2895,6 +3090,7 @@
           <w:rStyle w:val="NormalTok"/>
           <w:rFonts w:ascii="Consolas" w:hAnsi="Consolas"/>
           <w:sz w:val="20"/>
+          <w:shd w:fill="F5F5F5"/>
         </w:rPr>
         <w:t xml:space="preserve">)</w:t>
       </w:r>
@@ -2902,14 +3098,16 @@
         <w:rPr>
           <w:rFonts w:ascii="Consolas" w:hAnsi="Consolas"/>
           <w:sz w:val="20"/>
-        </w:rPr>
-        <w:br/>
-      </w:r>
-      <w:r>
-        <w:rPr>
-          <w:rStyle w:val="NormalTok"/>
-          <w:rFonts w:ascii="Consolas" w:hAnsi="Consolas"/>
-          <w:sz w:val="20"/>
+          <w:shd w:fill="F5F5F5"/>
+        </w:rPr>
+        <w:br/>
+      </w:r>
+      <w:r>
+        <w:rPr>
+          <w:rStyle w:val="NormalTok"/>
+          <w:rFonts w:ascii="Consolas" w:hAnsi="Consolas"/>
+          <w:sz w:val="20"/>
+          <w:shd w:fill="F5F5F5"/>
         </w:rPr>
         <w:t xml:space="preserve">    </w:t>
       </w:r>
@@ -2917,14 +3115,16 @@
         <w:rPr>
           <w:rFonts w:ascii="Consolas" w:hAnsi="Consolas"/>
           <w:sz w:val="20"/>
-        </w:rPr>
-        <w:br/>
-      </w:r>
-      <w:r>
-        <w:rPr>
-          <w:rStyle w:val="NormalTok"/>
-          <w:rFonts w:ascii="Consolas" w:hAnsi="Consolas"/>
-          <w:sz w:val="20"/>
+          <w:shd w:fill="F5F5F5"/>
+        </w:rPr>
+        <w:br/>
+      </w:r>
+      <w:r>
+        <w:rPr>
+          <w:rStyle w:val="NormalTok"/>
+          <w:rFonts w:ascii="Consolas" w:hAnsi="Consolas"/>
+          <w:sz w:val="20"/>
+          <w:shd w:fill="F5F5F5"/>
         </w:rPr>
         <w:t xml:space="preserve">    </w:t>
       </w:r>
@@ -2933,6 +3133,7 @@
           <w:rStyle w:val="ControlFlowTok"/>
           <w:rFonts w:ascii="Consolas" w:hAnsi="Consolas"/>
           <w:sz w:val="20"/>
+          <w:shd w:fill="F5F5F5"/>
         </w:rPr>
         <w:t xml:space="preserve">try</w:t>
       </w:r>
@@ -2941,6 +3142,7 @@
           <w:rStyle w:val="NormalTok"/>
           <w:rFonts w:ascii="Consolas" w:hAnsi="Consolas"/>
           <w:sz w:val="20"/>
+          <w:shd w:fill="F5F5F5"/>
         </w:rPr>
         <w:t xml:space="preserve">:</w:t>
       </w:r>
@@ -2948,14 +3150,16 @@
         <w:rPr>
           <w:rFonts w:ascii="Consolas" w:hAnsi="Consolas"/>
           <w:sz w:val="20"/>
-        </w:rPr>
-        <w:br/>
-      </w:r>
-      <w:r>
-        <w:rPr>
-          <w:rStyle w:val="NormalTok"/>
-          <w:rFonts w:ascii="Consolas" w:hAnsi="Consolas"/>
-          <w:sz w:val="20"/>
+          <w:shd w:fill="F5F5F5"/>
+        </w:rPr>
+        <w:br/>
+      </w:r>
+      <w:r>
+        <w:rPr>
+          <w:rStyle w:val="NormalTok"/>
+          <w:rFonts w:ascii="Consolas" w:hAnsi="Consolas"/>
+          <w:sz w:val="20"/>
+          <w:shd w:fill="F5F5F5"/>
         </w:rPr>
         <w:t xml:space="preserve">        num1 </w:t>
       </w:r>
@@ -2964,6 +3168,7 @@
           <w:rStyle w:val="OperatorTok"/>
           <w:rFonts w:ascii="Consolas" w:hAnsi="Consolas"/>
           <w:sz w:val="20"/>
+          <w:shd w:fill="F5F5F5"/>
         </w:rPr>
         <w:t xml:space="preserve">=</w:t>
       </w:r>
@@ -2972,6 +3177,7 @@
           <w:rStyle w:val="NormalTok"/>
           <w:rFonts w:ascii="Consolas" w:hAnsi="Consolas"/>
           <w:sz w:val="20"/>
+          <w:shd w:fill="F5F5F5"/>
         </w:rPr>
         <w:t xml:space="preserve"> </w:t>
       </w:r>
@@ -2980,6 +3186,7 @@
           <w:rStyle w:val="BuiltInTok"/>
           <w:rFonts w:ascii="Consolas" w:hAnsi="Consolas"/>
           <w:sz w:val="20"/>
+          <w:shd w:fill="F5F5F5"/>
         </w:rPr>
         <w:t xml:space="preserve">float</w:t>
       </w:r>
@@ -2988,6 +3195,7 @@
           <w:rStyle w:val="NormalTok"/>
           <w:rFonts w:ascii="Consolas" w:hAnsi="Consolas"/>
           <w:sz w:val="20"/>
+          <w:shd w:fill="F5F5F5"/>
         </w:rPr>
         <w:t xml:space="preserve">(</w:t>
       </w:r>
@@ -2996,6 +3204,7 @@
           <w:rStyle w:val="BuiltInTok"/>
           <w:rFonts w:ascii="Consolas" w:hAnsi="Consolas"/>
           <w:sz w:val="20"/>
+          <w:shd w:fill="F5F5F5"/>
         </w:rPr>
         <w:t xml:space="preserve">input</w:t>
       </w:r>
@@ -3004,6 +3213,7 @@
           <w:rStyle w:val="NormalTok"/>
           <w:rFonts w:ascii="Consolas" w:hAnsi="Consolas"/>
           <w:sz w:val="20"/>
+          <w:shd w:fill="F5F5F5"/>
         </w:rPr>
         <w:t xml:space="preserve">(</w:t>
       </w:r>
@@ -3012,6 +3222,7 @@
           <w:rStyle w:val="StringTok"/>
           <w:rFonts w:ascii="Consolas" w:hAnsi="Consolas"/>
           <w:sz w:val="20"/>
+          <w:shd w:fill="F5F5F5"/>
         </w:rPr>
         <w:t xml:space="preserve">"Enter the first number (numerator): "</w:t>
       </w:r>
@@ -3020,6 +3231,7 @@
           <w:rStyle w:val="NormalTok"/>
           <w:rFonts w:ascii="Consolas" w:hAnsi="Consolas"/>
           <w:sz w:val="20"/>
+          <w:shd w:fill="F5F5F5"/>
         </w:rPr>
         <w:t xml:space="preserve">))</w:t>
       </w:r>
@@ -3027,14 +3239,16 @@
         <w:rPr>
           <w:rFonts w:ascii="Consolas" w:hAnsi="Consolas"/>
           <w:sz w:val="20"/>
-        </w:rPr>
-        <w:br/>
-      </w:r>
-      <w:r>
-        <w:rPr>
-          <w:rStyle w:val="NormalTok"/>
-          <w:rFonts w:ascii="Consolas" w:hAnsi="Consolas"/>
-          <w:sz w:val="20"/>
+          <w:shd w:fill="F5F5F5"/>
+        </w:rPr>
+        <w:br/>
+      </w:r>
+      <w:r>
+        <w:rPr>
+          <w:rStyle w:val="NormalTok"/>
+          <w:rFonts w:ascii="Consolas" w:hAnsi="Consolas"/>
+          <w:sz w:val="20"/>
+          <w:shd w:fill="F5F5F5"/>
         </w:rPr>
         <w:t xml:space="preserve">        num2 </w:t>
       </w:r>
@@ -3043,6 +3257,7 @@
           <w:rStyle w:val="OperatorTok"/>
           <w:rFonts w:ascii="Consolas" w:hAnsi="Consolas"/>
           <w:sz w:val="20"/>
+          <w:shd w:fill="F5F5F5"/>
         </w:rPr>
         <w:t xml:space="preserve">=</w:t>
       </w:r>
@@ -3051,6 +3266,7 @@
           <w:rStyle w:val="NormalTok"/>
           <w:rFonts w:ascii="Consolas" w:hAnsi="Consolas"/>
           <w:sz w:val="20"/>
+          <w:shd w:fill="F5F5F5"/>
         </w:rPr>
         <w:t xml:space="preserve"> </w:t>
       </w:r>
@@ -3059,6 +3275,7 @@
           <w:rStyle w:val="BuiltInTok"/>
           <w:rFonts w:ascii="Consolas" w:hAnsi="Consolas"/>
           <w:sz w:val="20"/>
+          <w:shd w:fill="F5F5F5"/>
         </w:rPr>
         <w:t xml:space="preserve">float</w:t>
       </w:r>
@@ -3067,6 +3284,7 @@
           <w:rStyle w:val="NormalTok"/>
           <w:rFonts w:ascii="Consolas" w:hAnsi="Consolas"/>
           <w:sz w:val="20"/>
+          <w:shd w:fill="F5F5F5"/>
         </w:rPr>
         <w:t xml:space="preserve">(</w:t>
       </w:r>
@@ -3075,6 +3293,7 @@
           <w:rStyle w:val="BuiltInTok"/>
           <w:rFonts w:ascii="Consolas" w:hAnsi="Consolas"/>
           <w:sz w:val="20"/>
+          <w:shd w:fill="F5F5F5"/>
         </w:rPr>
         <w:t xml:space="preserve">input</w:t>
       </w:r>
@@ -3083,6 +3302,7 @@
           <w:rStyle w:val="NormalTok"/>
           <w:rFonts w:ascii="Consolas" w:hAnsi="Consolas"/>
           <w:sz w:val="20"/>
+          <w:shd w:fill="F5F5F5"/>
         </w:rPr>
         <w:t xml:space="preserve">(</w:t>
       </w:r>
@@ -3091,6 +3311,7 @@
           <w:rStyle w:val="StringTok"/>
           <w:rFonts w:ascii="Consolas" w:hAnsi="Consolas"/>
           <w:sz w:val="20"/>
+          <w:shd w:fill="F5F5F5"/>
         </w:rPr>
         <w:t xml:space="preserve">"Enter the second number (denominator): "</w:t>
       </w:r>
@@ -3099,6 +3320,7 @@
           <w:rStyle w:val="NormalTok"/>
           <w:rFonts w:ascii="Consolas" w:hAnsi="Consolas"/>
           <w:sz w:val="20"/>
+          <w:shd w:fill="F5F5F5"/>
         </w:rPr>
         <w:t xml:space="preserve">))</w:t>
       </w:r>
@@ -3106,14 +3328,16 @@
         <w:rPr>
           <w:rFonts w:ascii="Consolas" w:hAnsi="Consolas"/>
           <w:sz w:val="20"/>
-        </w:rPr>
-        <w:br/>
-      </w:r>
-      <w:r>
-        <w:rPr>
-          <w:rStyle w:val="NormalTok"/>
-          <w:rFonts w:ascii="Consolas" w:hAnsi="Consolas"/>
-          <w:sz w:val="20"/>
+          <w:shd w:fill="F5F5F5"/>
+        </w:rPr>
+        <w:br/>
+      </w:r>
+      <w:r>
+        <w:rPr>
+          <w:rStyle w:val="NormalTok"/>
+          <w:rFonts w:ascii="Consolas" w:hAnsi="Consolas"/>
+          <w:sz w:val="20"/>
+          <w:shd w:fill="F5F5F5"/>
         </w:rPr>
         <w:t xml:space="preserve">        </w:t>
       </w:r>
@@ -3121,14 +3345,16 @@
         <w:rPr>
           <w:rFonts w:ascii="Consolas" w:hAnsi="Consolas"/>
           <w:sz w:val="20"/>
-        </w:rPr>
-        <w:br/>
-      </w:r>
-      <w:r>
-        <w:rPr>
-          <w:rStyle w:val="NormalTok"/>
-          <w:rFonts w:ascii="Consolas" w:hAnsi="Consolas"/>
-          <w:sz w:val="20"/>
+          <w:shd w:fill="F5F5F5"/>
+        </w:rPr>
+        <w:br/>
+      </w:r>
+      <w:r>
+        <w:rPr>
+          <w:rStyle w:val="NormalTok"/>
+          <w:rFonts w:ascii="Consolas" w:hAnsi="Consolas"/>
+          <w:sz w:val="20"/>
+          <w:shd w:fill="F5F5F5"/>
         </w:rPr>
         <w:t xml:space="preserve">        </w:t>
       </w:r>
@@ -3137,6 +3363,7 @@
           <w:rStyle w:val="ControlFlowTok"/>
           <w:rFonts w:ascii="Consolas" w:hAnsi="Consolas"/>
           <w:sz w:val="20"/>
+          <w:shd w:fill="F5F5F5"/>
         </w:rPr>
         <w:t xml:space="preserve">if</w:t>
       </w:r>
@@ -3145,6 +3372,7 @@
           <w:rStyle w:val="NormalTok"/>
           <w:rFonts w:ascii="Consolas" w:hAnsi="Consolas"/>
           <w:sz w:val="20"/>
+          <w:shd w:fill="F5F5F5"/>
         </w:rPr>
         <w:t xml:space="preserve"> num2 </w:t>
       </w:r>
@@ -3153,6 +3381,7 @@
           <w:rStyle w:val="OperatorTok"/>
           <w:rFonts w:ascii="Consolas" w:hAnsi="Consolas"/>
           <w:sz w:val="20"/>
+          <w:shd w:fill="F5F5F5"/>
         </w:rPr>
         <w:t xml:space="preserve">==</w:t>
       </w:r>
@@ -3161,6 +3390,7 @@
           <w:rStyle w:val="NormalTok"/>
           <w:rFonts w:ascii="Consolas" w:hAnsi="Consolas"/>
           <w:sz w:val="20"/>
+          <w:shd w:fill="F5F5F5"/>
         </w:rPr>
         <w:t xml:space="preserve"> </w:t>
       </w:r>
@@ -3169,6 +3399,7 @@
           <w:rStyle w:val="DecValTok"/>
           <w:rFonts w:ascii="Consolas" w:hAnsi="Consolas"/>
           <w:sz w:val="20"/>
+          <w:shd w:fill="F5F5F5"/>
         </w:rPr>
         <w:t xml:space="preserve">0</w:t>
       </w:r>
@@ -3177,6 +3408,7 @@
           <w:rStyle w:val="NormalTok"/>
           <w:rFonts w:ascii="Consolas" w:hAnsi="Consolas"/>
           <w:sz w:val="20"/>
+          <w:shd w:fill="F5F5F5"/>
         </w:rPr>
         <w:t xml:space="preserve">:</w:t>
       </w:r>
@@ -3184,14 +3416,16 @@
         <w:rPr>
           <w:rFonts w:ascii="Consolas" w:hAnsi="Consolas"/>
           <w:sz w:val="20"/>
-        </w:rPr>
-        <w:br/>
-      </w:r>
-      <w:r>
-        <w:rPr>
-          <w:rStyle w:val="NormalTok"/>
-          <w:rFonts w:ascii="Consolas" w:hAnsi="Consolas"/>
-          <w:sz w:val="20"/>
+          <w:shd w:fill="F5F5F5"/>
+        </w:rPr>
+        <w:br/>
+      </w:r>
+      <w:r>
+        <w:rPr>
+          <w:rStyle w:val="NormalTok"/>
+          <w:rFonts w:ascii="Consolas" w:hAnsi="Consolas"/>
+          <w:sz w:val="20"/>
+          <w:shd w:fill="F5F5F5"/>
         </w:rPr>
         <w:t xml:space="preserve">            </w:t>
       </w:r>
@@ -3200,6 +3434,7 @@
           <w:rStyle w:val="ControlFlowTok"/>
           <w:rFonts w:ascii="Consolas" w:hAnsi="Consolas"/>
           <w:sz w:val="20"/>
+          <w:shd w:fill="F5F5F5"/>
         </w:rPr>
         <w:t xml:space="preserve">raise</w:t>
       </w:r>
@@ -3208,6 +3443,7 @@
           <w:rStyle w:val="NormalTok"/>
           <w:rFonts w:ascii="Consolas" w:hAnsi="Consolas"/>
           <w:sz w:val="20"/>
+          <w:shd w:fill="F5F5F5"/>
         </w:rPr>
         <w:t xml:space="preserve"> </w:t>
       </w:r>
@@ -3216,6 +3452,7 @@
           <w:rStyle w:val="PreprocessorTok"/>
           <w:rFonts w:ascii="Consolas" w:hAnsi="Consolas"/>
           <w:sz w:val="20"/>
+          <w:shd w:fill="F5F5F5"/>
         </w:rPr>
         <w:t xml:space="preserve">ZeroDivisionError</w:t>
       </w:r>
@@ -3224,6 +3461,7 @@
           <w:rStyle w:val="NormalTok"/>
           <w:rFonts w:ascii="Consolas" w:hAnsi="Consolas"/>
           <w:sz w:val="20"/>
+          <w:shd w:fill="F5F5F5"/>
         </w:rPr>
         <w:t xml:space="preserve">(</w:t>
       </w:r>
@@ -3232,6 +3470,7 @@
           <w:rStyle w:val="StringTok"/>
           <w:rFonts w:ascii="Consolas" w:hAnsi="Consolas"/>
           <w:sz w:val="20"/>
+          <w:shd w:fill="F5F5F5"/>
         </w:rPr>
         <w:t xml:space="preserve">"Cannot divide by zero. Please enter a non-zero denominator."</w:t>
       </w:r>
@@ -3240,6 +3479,7 @@
           <w:rStyle w:val="NormalTok"/>
           <w:rFonts w:ascii="Consolas" w:hAnsi="Consolas"/>
           <w:sz w:val="20"/>
+          <w:shd w:fill="F5F5F5"/>
         </w:rPr>
         <w:t xml:space="preserve">)</w:t>
       </w:r>
@@ -3247,14 +3487,16 @@
         <w:rPr>
           <w:rFonts w:ascii="Consolas" w:hAnsi="Consolas"/>
           <w:sz w:val="20"/>
-        </w:rPr>
-        <w:br/>
-      </w:r>
-      <w:r>
-        <w:rPr>
-          <w:rStyle w:val="NormalTok"/>
-          <w:rFonts w:ascii="Consolas" w:hAnsi="Consolas"/>
-          <w:sz w:val="20"/>
+          <w:shd w:fill="F5F5F5"/>
+        </w:rPr>
+        <w:br/>
+      </w:r>
+      <w:r>
+        <w:rPr>
+          <w:rStyle w:val="NormalTok"/>
+          <w:rFonts w:ascii="Consolas" w:hAnsi="Consolas"/>
+          <w:sz w:val="20"/>
+          <w:shd w:fill="F5F5F5"/>
         </w:rPr>
         <w:t xml:space="preserve">        </w:t>
       </w:r>
@@ -3262,14 +3504,16 @@
         <w:rPr>
           <w:rFonts w:ascii="Consolas" w:hAnsi="Consolas"/>
           <w:sz w:val="20"/>
-        </w:rPr>
-        <w:br/>
-      </w:r>
-      <w:r>
-        <w:rPr>
-          <w:rStyle w:val="NormalTok"/>
-          <w:rFonts w:ascii="Consolas" w:hAnsi="Consolas"/>
-          <w:sz w:val="20"/>
+          <w:shd w:fill="F5F5F5"/>
+        </w:rPr>
+        <w:br/>
+      </w:r>
+      <w:r>
+        <w:rPr>
+          <w:rStyle w:val="NormalTok"/>
+          <w:rFonts w:ascii="Consolas" w:hAnsi="Consolas"/>
+          <w:sz w:val="20"/>
+          <w:shd w:fill="F5F5F5"/>
         </w:rPr>
         <w:t xml:space="preserve">        result </w:t>
       </w:r>
@@ -3278,6 +3522,7 @@
           <w:rStyle w:val="OperatorTok"/>
           <w:rFonts w:ascii="Consolas" w:hAnsi="Consolas"/>
           <w:sz w:val="20"/>
+          <w:shd w:fill="F5F5F5"/>
         </w:rPr>
         <w:t xml:space="preserve">=</w:t>
       </w:r>
@@ -3286,6 +3531,7 @@
           <w:rStyle w:val="NormalTok"/>
           <w:rFonts w:ascii="Consolas" w:hAnsi="Consolas"/>
           <w:sz w:val="20"/>
+          <w:shd w:fill="F5F5F5"/>
         </w:rPr>
         <w:t xml:space="preserve"> num1 </w:t>
       </w:r>
@@ -3294,6 +3540,7 @@
           <w:rStyle w:val="OperatorTok"/>
           <w:rFonts w:ascii="Consolas" w:hAnsi="Consolas"/>
           <w:sz w:val="20"/>
+          <w:shd w:fill="F5F5F5"/>
         </w:rPr>
         <w:t xml:space="preserve">/</w:t>
       </w:r>
@@ -3302,6 +3549,7 @@
           <w:rStyle w:val="NormalTok"/>
           <w:rFonts w:ascii="Consolas" w:hAnsi="Consolas"/>
           <w:sz w:val="20"/>
+          <w:shd w:fill="F5F5F5"/>
         </w:rPr>
         <w:t xml:space="preserve"> num2</w:t>
       </w:r>
@@ -3309,14 +3557,16 @@
         <w:rPr>
           <w:rFonts w:ascii="Consolas" w:hAnsi="Consolas"/>
           <w:sz w:val="20"/>
-        </w:rPr>
-        <w:br/>
-      </w:r>
-      <w:r>
-        <w:rPr>
-          <w:rStyle w:val="NormalTok"/>
-          <w:rFonts w:ascii="Consolas" w:hAnsi="Consolas"/>
-          <w:sz w:val="20"/>
+          <w:shd w:fill="F5F5F5"/>
+        </w:rPr>
+        <w:br/>
+      </w:r>
+      <w:r>
+        <w:rPr>
+          <w:rStyle w:val="NormalTok"/>
+          <w:rFonts w:ascii="Consolas" w:hAnsi="Consolas"/>
+          <w:sz w:val="20"/>
+          <w:shd w:fill="F5F5F5"/>
         </w:rPr>
         <w:t xml:space="preserve">        </w:t>
       </w:r>
@@ -3325,6 +3575,7 @@
           <w:rStyle w:val="BuiltInTok"/>
           <w:rFonts w:ascii="Consolas" w:hAnsi="Consolas"/>
           <w:sz w:val="20"/>
+          <w:shd w:fill="F5F5F5"/>
         </w:rPr>
         <w:t xml:space="preserve">print</w:t>
       </w:r>
@@ -3333,6 +3584,7 @@
           <w:rStyle w:val="NormalTok"/>
           <w:rFonts w:ascii="Consolas" w:hAnsi="Consolas"/>
           <w:sz w:val="20"/>
+          <w:shd w:fill="F5F5F5"/>
         </w:rPr>
         <w:t xml:space="preserve">(</w:t>
       </w:r>
@@ -3341,6 +3593,7 @@
           <w:rStyle w:val="SpecialStringTok"/>
           <w:rFonts w:ascii="Consolas" w:hAnsi="Consolas"/>
           <w:sz w:val="20"/>
+          <w:shd w:fill="F5F5F5"/>
         </w:rPr>
         <w:t xml:space="preserve">f"Result: </w:t>
       </w:r>
@@ -3349,6 +3602,7 @@
           <w:rStyle w:val="SpecialCharTok"/>
           <w:rFonts w:ascii="Consolas" w:hAnsi="Consolas"/>
           <w:sz w:val="20"/>
+          <w:shd w:fill="F5F5F5"/>
         </w:rPr>
         <w:t xml:space="preserve">{</w:t>
       </w:r>
@@ -3357,6 +3611,7 @@
           <w:rStyle w:val="NormalTok"/>
           <w:rFonts w:ascii="Consolas" w:hAnsi="Consolas"/>
           <w:sz w:val="20"/>
+          <w:shd w:fill="F5F5F5"/>
         </w:rPr>
         <w:t xml:space="preserve">num1</w:t>
       </w:r>
@@ -3365,6 +3620,7 @@
           <w:rStyle w:val="SpecialCharTok"/>
           <w:rFonts w:ascii="Consolas" w:hAnsi="Consolas"/>
           <w:sz w:val="20"/>
+          <w:shd w:fill="F5F5F5"/>
         </w:rPr>
         <w:t xml:space="preserve">}</w:t>
       </w:r>
@@ -3373,6 +3629,7 @@
           <w:rStyle w:val="SpecialStringTok"/>
           <w:rFonts w:ascii="Consolas" w:hAnsi="Consolas"/>
           <w:sz w:val="20"/>
+          <w:shd w:fill="F5F5F5"/>
         </w:rPr>
         <w:t xml:space="preserve"> / </w:t>
       </w:r>
@@ -3381,6 +3638,7 @@
           <w:rStyle w:val="SpecialCharTok"/>
           <w:rFonts w:ascii="Consolas" w:hAnsi="Consolas"/>
           <w:sz w:val="20"/>
+          <w:shd w:fill="F5F5F5"/>
         </w:rPr>
         <w:t xml:space="preserve">{</w:t>
       </w:r>
@@ -3389,6 +3647,7 @@
           <w:rStyle w:val="NormalTok"/>
           <w:rFonts w:ascii="Consolas" w:hAnsi="Consolas"/>
           <w:sz w:val="20"/>
+          <w:shd w:fill="F5F5F5"/>
         </w:rPr>
         <w:t xml:space="preserve">num2</w:t>
       </w:r>
@@ -3397,6 +3656,7 @@
           <w:rStyle w:val="SpecialCharTok"/>
           <w:rFonts w:ascii="Consolas" w:hAnsi="Consolas"/>
           <w:sz w:val="20"/>
+          <w:shd w:fill="F5F5F5"/>
         </w:rPr>
         <w:t xml:space="preserve">}</w:t>
       </w:r>
@@ -3405,6 +3665,7 @@
           <w:rStyle w:val="SpecialStringTok"/>
           <w:rFonts w:ascii="Consolas" w:hAnsi="Consolas"/>
           <w:sz w:val="20"/>
+          <w:shd w:fill="F5F5F5"/>
         </w:rPr>
         <w:t xml:space="preserve"> = </w:t>
       </w:r>
@@ -3413,6 +3674,7 @@
           <w:rStyle w:val="SpecialCharTok"/>
           <w:rFonts w:ascii="Consolas" w:hAnsi="Consolas"/>
           <w:sz w:val="20"/>
+          <w:shd w:fill="F5F5F5"/>
         </w:rPr>
         <w:t xml:space="preserve">{</w:t>
       </w:r>
@@ -3421,6 +3683,7 @@
           <w:rStyle w:val="NormalTok"/>
           <w:rFonts w:ascii="Consolas" w:hAnsi="Consolas"/>
           <w:sz w:val="20"/>
+          <w:shd w:fill="F5F5F5"/>
         </w:rPr>
         <w:t xml:space="preserve">result</w:t>
       </w:r>
@@ -3429,6 +3692,7 @@
           <w:rStyle w:val="SpecialCharTok"/>
           <w:rFonts w:ascii="Consolas" w:hAnsi="Consolas"/>
           <w:sz w:val="20"/>
+          <w:shd w:fill="F5F5F5"/>
         </w:rPr>
         <w:t xml:space="preserve">:.2f}</w:t>
       </w:r>
@@ -3437,6 +3701,7 @@
           <w:rStyle w:val="SpecialStringTok"/>
           <w:rFonts w:ascii="Consolas" w:hAnsi="Consolas"/>
           <w:sz w:val="20"/>
+          <w:shd w:fill="F5F5F5"/>
         </w:rPr>
         <w:t xml:space="preserve">"</w:t>
       </w:r>
@@ -3445,6 +3710,7 @@
           <w:rStyle w:val="NormalTok"/>
           <w:rFonts w:ascii="Consolas" w:hAnsi="Consolas"/>
           <w:sz w:val="20"/>
+          <w:shd w:fill="F5F5F5"/>
         </w:rPr>
         <w:t xml:space="preserve">)</w:t>
       </w:r>
@@ -3452,14 +3718,16 @@
         <w:rPr>
           <w:rFonts w:ascii="Consolas" w:hAnsi="Consolas"/>
           <w:sz w:val="20"/>
-        </w:rPr>
-        <w:br/>
-      </w:r>
-      <w:r>
-        <w:rPr>
-          <w:rStyle w:val="NormalTok"/>
-          <w:rFonts w:ascii="Consolas" w:hAnsi="Consolas"/>
-          <w:sz w:val="20"/>
+          <w:shd w:fill="F5F5F5"/>
+        </w:rPr>
+        <w:br/>
+      </w:r>
+      <w:r>
+        <w:rPr>
+          <w:rStyle w:val="NormalTok"/>
+          <w:rFonts w:ascii="Consolas" w:hAnsi="Consolas"/>
+          <w:sz w:val="20"/>
+          <w:shd w:fill="F5F5F5"/>
         </w:rPr>
         <w:t xml:space="preserve">        </w:t>
       </w:r>
@@ -3467,14 +3735,16 @@
         <w:rPr>
           <w:rFonts w:ascii="Consolas" w:hAnsi="Consolas"/>
           <w:sz w:val="20"/>
-        </w:rPr>
-        <w:br/>
-      </w:r>
-      <w:r>
-        <w:rPr>
-          <w:rStyle w:val="NormalTok"/>
-          <w:rFonts w:ascii="Consolas" w:hAnsi="Consolas"/>
-          <w:sz w:val="20"/>
+          <w:shd w:fill="F5F5F5"/>
+        </w:rPr>
+        <w:br/>
+      </w:r>
+      <w:r>
+        <w:rPr>
+          <w:rStyle w:val="NormalTok"/>
+          <w:rFonts w:ascii="Consolas" w:hAnsi="Consolas"/>
+          <w:sz w:val="20"/>
+          <w:shd w:fill="F5F5F5"/>
         </w:rPr>
         <w:t xml:space="preserve">    </w:t>
       </w:r>
@@ -3483,6 +3753,7 @@
           <w:rStyle w:val="ControlFlowTok"/>
           <w:rFonts w:ascii="Consolas" w:hAnsi="Consolas"/>
           <w:sz w:val="20"/>
+          <w:shd w:fill="F5F5F5"/>
         </w:rPr>
         <w:t xml:space="preserve">except</w:t>
       </w:r>
@@ -3491,6 +3762,7 @@
           <w:rStyle w:val="NormalTok"/>
           <w:rFonts w:ascii="Consolas" w:hAnsi="Consolas"/>
           <w:sz w:val="20"/>
+          <w:shd w:fill="F5F5F5"/>
         </w:rPr>
         <w:t xml:space="preserve"> </w:t>
       </w:r>
@@ -3499,6 +3771,7 @@
           <w:rStyle w:val="PreprocessorTok"/>
           <w:rFonts w:ascii="Consolas" w:hAnsi="Consolas"/>
           <w:sz w:val="20"/>
+          <w:shd w:fill="F5F5F5"/>
         </w:rPr>
         <w:t xml:space="preserve">ValueError</w:t>
       </w:r>
@@ -3507,6 +3780,7 @@
           <w:rStyle w:val="NormalTok"/>
           <w:rFonts w:ascii="Consolas" w:hAnsi="Consolas"/>
           <w:sz w:val="20"/>
+          <w:shd w:fill="F5F5F5"/>
         </w:rPr>
         <w:t xml:space="preserve">:</w:t>
       </w:r>
@@ -3514,14 +3788,16 @@
         <w:rPr>
           <w:rFonts w:ascii="Consolas" w:hAnsi="Consolas"/>
           <w:sz w:val="20"/>
-        </w:rPr>
-        <w:br/>
-      </w:r>
-      <w:r>
-        <w:rPr>
-          <w:rStyle w:val="NormalTok"/>
-          <w:rFonts w:ascii="Consolas" w:hAnsi="Consolas"/>
-          <w:sz w:val="20"/>
+          <w:shd w:fill="F5F5F5"/>
+        </w:rPr>
+        <w:br/>
+      </w:r>
+      <w:r>
+        <w:rPr>
+          <w:rStyle w:val="NormalTok"/>
+          <w:rFonts w:ascii="Consolas" w:hAnsi="Consolas"/>
+          <w:sz w:val="20"/>
+          <w:shd w:fill="F5F5F5"/>
         </w:rPr>
         <w:t xml:space="preserve">        </w:t>
       </w:r>
@@ -3530,6 +3806,7 @@
           <w:rStyle w:val="BuiltInTok"/>
           <w:rFonts w:ascii="Consolas" w:hAnsi="Consolas"/>
           <w:sz w:val="20"/>
+          <w:shd w:fill="F5F5F5"/>
         </w:rPr>
         <w:t xml:space="preserve">print</w:t>
       </w:r>
@@ -3538,6 +3815,7 @@
           <w:rStyle w:val="NormalTok"/>
           <w:rFonts w:ascii="Consolas" w:hAnsi="Consolas"/>
           <w:sz w:val="20"/>
+          <w:shd w:fill="F5F5F5"/>
         </w:rPr>
         <w:t xml:space="preserve">(</w:t>
       </w:r>
@@ -3546,6 +3824,7 @@
           <w:rStyle w:val="StringTok"/>
           <w:rFonts w:ascii="Consolas" w:hAnsi="Consolas"/>
           <w:sz w:val="20"/>
+          <w:shd w:fill="F5F5F5"/>
         </w:rPr>
         <w:t xml:space="preserve">"Error: Invalid input. Please enter numeric values only."</w:t>
       </w:r>
@@ -3554,6 +3833,7 @@
           <w:rStyle w:val="NormalTok"/>
           <w:rFonts w:ascii="Consolas" w:hAnsi="Consolas"/>
           <w:sz w:val="20"/>
+          <w:shd w:fill="F5F5F5"/>
         </w:rPr>
         <w:t xml:space="preserve">)</w:t>
       </w:r>
@@ -3561,14 +3841,16 @@
         <w:rPr>
           <w:rFonts w:ascii="Consolas" w:hAnsi="Consolas"/>
           <w:sz w:val="20"/>
-        </w:rPr>
-        <w:br/>
-      </w:r>
-      <w:r>
-        <w:rPr>
-          <w:rStyle w:val="NormalTok"/>
-          <w:rFonts w:ascii="Consolas" w:hAnsi="Consolas"/>
-          <w:sz w:val="20"/>
+          <w:shd w:fill="F5F5F5"/>
+        </w:rPr>
+        <w:br/>
+      </w:r>
+      <w:r>
+        <w:rPr>
+          <w:rStyle w:val="NormalTok"/>
+          <w:rFonts w:ascii="Consolas" w:hAnsi="Consolas"/>
+          <w:sz w:val="20"/>
+          <w:shd w:fill="F5F5F5"/>
         </w:rPr>
         <w:t xml:space="preserve">    </w:t>
       </w:r>
@@ -3577,6 +3859,7 @@
           <w:rStyle w:val="ControlFlowTok"/>
           <w:rFonts w:ascii="Consolas" w:hAnsi="Consolas"/>
           <w:sz w:val="20"/>
+          <w:shd w:fill="F5F5F5"/>
         </w:rPr>
         <w:t xml:space="preserve">except</w:t>
       </w:r>
@@ -3585,6 +3868,7 @@
           <w:rStyle w:val="NormalTok"/>
           <w:rFonts w:ascii="Consolas" w:hAnsi="Consolas"/>
           <w:sz w:val="20"/>
+          <w:shd w:fill="F5F5F5"/>
         </w:rPr>
         <w:t xml:space="preserve"> </w:t>
       </w:r>
@@ -3593,6 +3877,7 @@
           <w:rStyle w:val="PreprocessorTok"/>
           <w:rFonts w:ascii="Consolas" w:hAnsi="Consolas"/>
           <w:sz w:val="20"/>
+          <w:shd w:fill="F5F5F5"/>
         </w:rPr>
         <w:t xml:space="preserve">ZeroDivisionError</w:t>
       </w:r>
@@ -3601,6 +3886,7 @@
           <w:rStyle w:val="NormalTok"/>
           <w:rFonts w:ascii="Consolas" w:hAnsi="Consolas"/>
           <w:sz w:val="20"/>
+          <w:shd w:fill="F5F5F5"/>
         </w:rPr>
         <w:t xml:space="preserve"> </w:t>
       </w:r>
@@ -3609,6 +3895,7 @@
           <w:rStyle w:val="ImportTok"/>
           <w:rFonts w:ascii="Consolas" w:hAnsi="Consolas"/>
           <w:sz w:val="20"/>
+          <w:shd w:fill="F5F5F5"/>
         </w:rPr>
         <w:t xml:space="preserve">as</w:t>
       </w:r>
@@ -3617,6 +3904,7 @@
           <w:rStyle w:val="NormalTok"/>
           <w:rFonts w:ascii="Consolas" w:hAnsi="Consolas"/>
           <w:sz w:val="20"/>
+          <w:shd w:fill="F5F5F5"/>
         </w:rPr>
         <w:t xml:space="preserve"> e:</w:t>
       </w:r>
@@ -3624,14 +3912,16 @@
         <w:rPr>
           <w:rFonts w:ascii="Consolas" w:hAnsi="Consolas"/>
           <w:sz w:val="20"/>
-        </w:rPr>
-        <w:br/>
-      </w:r>
-      <w:r>
-        <w:rPr>
-          <w:rStyle w:val="NormalTok"/>
-          <w:rFonts w:ascii="Consolas" w:hAnsi="Consolas"/>
-          <w:sz w:val="20"/>
+          <w:shd w:fill="F5F5F5"/>
+        </w:rPr>
+        <w:br/>
+      </w:r>
+      <w:r>
+        <w:rPr>
+          <w:rStyle w:val="NormalTok"/>
+          <w:rFonts w:ascii="Consolas" w:hAnsi="Consolas"/>
+          <w:sz w:val="20"/>
+          <w:shd w:fill="F5F5F5"/>
         </w:rPr>
         <w:t xml:space="preserve">        </w:t>
       </w:r>
@@ -3640,6 +3930,7 @@
           <w:rStyle w:val="BuiltInTok"/>
           <w:rFonts w:ascii="Consolas" w:hAnsi="Consolas"/>
           <w:sz w:val="20"/>
+          <w:shd w:fill="F5F5F5"/>
         </w:rPr>
         <w:t xml:space="preserve">print</w:t>
       </w:r>
@@ -3648,6 +3939,7 @@
           <w:rStyle w:val="NormalTok"/>
           <w:rFonts w:ascii="Consolas" w:hAnsi="Consolas"/>
           <w:sz w:val="20"/>
+          <w:shd w:fill="F5F5F5"/>
         </w:rPr>
         <w:t xml:space="preserve">(</w:t>
       </w:r>
@@ -3656,6 +3948,7 @@
           <w:rStyle w:val="SpecialStringTok"/>
           <w:rFonts w:ascii="Consolas" w:hAnsi="Consolas"/>
           <w:sz w:val="20"/>
+          <w:shd w:fill="F5F5F5"/>
         </w:rPr>
         <w:t xml:space="preserve">f"Error: </w:t>
       </w:r>
@@ -3664,6 +3957,7 @@
           <w:rStyle w:val="SpecialCharTok"/>
           <w:rFonts w:ascii="Consolas" w:hAnsi="Consolas"/>
           <w:sz w:val="20"/>
+          <w:shd w:fill="F5F5F5"/>
         </w:rPr>
         <w:t xml:space="preserve">{</w:t>
       </w:r>
@@ -3672,6 +3966,7 @@
           <w:rStyle w:val="NormalTok"/>
           <w:rFonts w:ascii="Consolas" w:hAnsi="Consolas"/>
           <w:sz w:val="20"/>
+          <w:shd w:fill="F5F5F5"/>
         </w:rPr>
         <w:t xml:space="preserve">e</w:t>
       </w:r>
@@ -3680,6 +3975,7 @@
           <w:rStyle w:val="SpecialCharTok"/>
           <w:rFonts w:ascii="Consolas" w:hAnsi="Consolas"/>
           <w:sz w:val="20"/>
+          <w:shd w:fill="F5F5F5"/>
         </w:rPr>
         <w:t xml:space="preserve">}</w:t>
       </w:r>
@@ -3688,6 +3984,7 @@
           <w:rStyle w:val="SpecialStringTok"/>
           <w:rFonts w:ascii="Consolas" w:hAnsi="Consolas"/>
           <w:sz w:val="20"/>
+          <w:shd w:fill="F5F5F5"/>
         </w:rPr>
         <w:t xml:space="preserve">"</w:t>
       </w:r>
@@ -3696,6 +3993,7 @@
           <w:rStyle w:val="NormalTok"/>
           <w:rFonts w:ascii="Consolas" w:hAnsi="Consolas"/>
           <w:sz w:val="20"/>
+          <w:shd w:fill="F5F5F5"/>
         </w:rPr>
         <w:t xml:space="preserve">)</w:t>
       </w:r>
@@ -3703,14 +4001,16 @@
         <w:rPr>
           <w:rFonts w:ascii="Consolas" w:hAnsi="Consolas"/>
           <w:sz w:val="20"/>
-        </w:rPr>
-        <w:br/>
-      </w:r>
-      <w:r>
-        <w:rPr>
-          <w:rStyle w:val="NormalTok"/>
-          <w:rFonts w:ascii="Consolas" w:hAnsi="Consolas"/>
-          <w:sz w:val="20"/>
+          <w:shd w:fill="F5F5F5"/>
+        </w:rPr>
+        <w:br/>
+      </w:r>
+      <w:r>
+        <w:rPr>
+          <w:rStyle w:val="NormalTok"/>
+          <w:rFonts w:ascii="Consolas" w:hAnsi="Consolas"/>
+          <w:sz w:val="20"/>
+          <w:shd w:fill="F5F5F5"/>
         </w:rPr>
         <w:t xml:space="preserve">    </w:t>
       </w:r>
@@ -3719,6 +4019,7 @@
           <w:rStyle w:val="ControlFlowTok"/>
           <w:rFonts w:ascii="Consolas" w:hAnsi="Consolas"/>
           <w:sz w:val="20"/>
+          <w:shd w:fill="F5F5F5"/>
         </w:rPr>
         <w:t xml:space="preserve">except</w:t>
       </w:r>
@@ -3727,6 +4028,7 @@
           <w:rStyle w:val="NormalTok"/>
           <w:rFonts w:ascii="Consolas" w:hAnsi="Consolas"/>
           <w:sz w:val="20"/>
+          <w:shd w:fill="F5F5F5"/>
         </w:rPr>
         <w:t xml:space="preserve"> </w:t>
       </w:r>
@@ -3735,6 +4037,7 @@
           <w:rStyle w:val="PreprocessorTok"/>
           <w:rFonts w:ascii="Consolas" w:hAnsi="Consolas"/>
           <w:sz w:val="20"/>
+          <w:shd w:fill="F5F5F5"/>
         </w:rPr>
         <w:t xml:space="preserve">Exception</w:t>
       </w:r>
@@ -3743,6 +4046,7 @@
           <w:rStyle w:val="NormalTok"/>
           <w:rFonts w:ascii="Consolas" w:hAnsi="Consolas"/>
           <w:sz w:val="20"/>
+          <w:shd w:fill="F5F5F5"/>
         </w:rPr>
         <w:t xml:space="preserve"> </w:t>
       </w:r>
@@ -3751,6 +4055,7 @@
           <w:rStyle w:val="ImportTok"/>
           <w:rFonts w:ascii="Consolas" w:hAnsi="Consolas"/>
           <w:sz w:val="20"/>
+          <w:shd w:fill="F5F5F5"/>
         </w:rPr>
         <w:t xml:space="preserve">as</w:t>
       </w:r>
@@ -3759,6 +4064,7 @@
           <w:rStyle w:val="NormalTok"/>
           <w:rFonts w:ascii="Consolas" w:hAnsi="Consolas"/>
           <w:sz w:val="20"/>
+          <w:shd w:fill="F5F5F5"/>
         </w:rPr>
         <w:t xml:space="preserve"> e:</w:t>
       </w:r>
@@ -3766,14 +4072,16 @@
         <w:rPr>
           <w:rFonts w:ascii="Consolas" w:hAnsi="Consolas"/>
           <w:sz w:val="20"/>
-        </w:rPr>
-        <w:br/>
-      </w:r>
-      <w:r>
-        <w:rPr>
-          <w:rStyle w:val="NormalTok"/>
-          <w:rFonts w:ascii="Consolas" w:hAnsi="Consolas"/>
-          <w:sz w:val="20"/>
+          <w:shd w:fill="F5F5F5"/>
+        </w:rPr>
+        <w:br/>
+      </w:r>
+      <w:r>
+        <w:rPr>
+          <w:rStyle w:val="NormalTok"/>
+          <w:rFonts w:ascii="Consolas" w:hAnsi="Consolas"/>
+          <w:sz w:val="20"/>
+          <w:shd w:fill="F5F5F5"/>
         </w:rPr>
         <w:t xml:space="preserve">        </w:t>
       </w:r>
@@ -3782,6 +4090,7 @@
           <w:rStyle w:val="BuiltInTok"/>
           <w:rFonts w:ascii="Consolas" w:hAnsi="Consolas"/>
           <w:sz w:val="20"/>
+          <w:shd w:fill="F5F5F5"/>
         </w:rPr>
         <w:t xml:space="preserve">print</w:t>
       </w:r>
@@ -3790,6 +4099,7 @@
           <w:rStyle w:val="NormalTok"/>
           <w:rFonts w:ascii="Consolas" w:hAnsi="Consolas"/>
           <w:sz w:val="20"/>
+          <w:shd w:fill="F5F5F5"/>
         </w:rPr>
         <w:t xml:space="preserve">(</w:t>
       </w:r>
@@ -3798,6 +4108,7 @@
           <w:rStyle w:val="SpecialStringTok"/>
           <w:rFonts w:ascii="Consolas" w:hAnsi="Consolas"/>
           <w:sz w:val="20"/>
+          <w:shd w:fill="F5F5F5"/>
         </w:rPr>
         <w:t xml:space="preserve">f"Unexpected error occurred: </w:t>
       </w:r>
@@ -3806,6 +4117,7 @@
           <w:rStyle w:val="SpecialCharTok"/>
           <w:rFonts w:ascii="Consolas" w:hAnsi="Consolas"/>
           <w:sz w:val="20"/>
+          <w:shd w:fill="F5F5F5"/>
         </w:rPr>
         <w:t xml:space="preserve">{</w:t>
       </w:r>
@@ -3814,6 +4126,7 @@
           <w:rStyle w:val="NormalTok"/>
           <w:rFonts w:ascii="Consolas" w:hAnsi="Consolas"/>
           <w:sz w:val="20"/>
+          <w:shd w:fill="F5F5F5"/>
         </w:rPr>
         <w:t xml:space="preserve">e</w:t>
       </w:r>
@@ -3822,6 +4135,7 @@
           <w:rStyle w:val="SpecialCharTok"/>
           <w:rFonts w:ascii="Consolas" w:hAnsi="Consolas"/>
           <w:sz w:val="20"/>
+          <w:shd w:fill="F5F5F5"/>
         </w:rPr>
         <w:t xml:space="preserve">}</w:t>
       </w:r>
@@ -3830,6 +4144,7 @@
           <w:rStyle w:val="SpecialStringTok"/>
           <w:rFonts w:ascii="Consolas" w:hAnsi="Consolas"/>
           <w:sz w:val="20"/>
+          <w:shd w:fill="F5F5F5"/>
         </w:rPr>
         <w:t xml:space="preserve">"</w:t>
       </w:r>
@@ -3838,6 +4153,7 @@
           <w:rStyle w:val="NormalTok"/>
           <w:rFonts w:ascii="Consolas" w:hAnsi="Consolas"/>
           <w:sz w:val="20"/>
+          <w:shd w:fill="F5F5F5"/>
         </w:rPr>
         <w:t xml:space="preserve">)</w:t>
       </w:r>
@@ -3845,13 +4161,15 @@
         <w:rPr>
           <w:rFonts w:ascii="Consolas" w:hAnsi="Consolas"/>
           <w:sz w:val="20"/>
-        </w:rPr>
-        <w:br/>
-      </w:r>
-      <w:r>
-        <w:rPr>
-          <w:rFonts w:ascii="Consolas" w:hAnsi="Consolas"/>
-          <w:sz w:val="20"/>
+          <w:shd w:fill="F5F5F5"/>
+        </w:rPr>
+        <w:br/>
+      </w:r>
+      <w:r>
+        <w:rPr>
+          <w:rFonts w:ascii="Consolas" w:hAnsi="Consolas"/>
+          <w:sz w:val="20"/>
+          <w:shd w:fill="F5F5F5"/>
         </w:rPr>
         <w:br/>
       </w:r>
@@ -3860,6 +4178,7 @@
           <w:rStyle w:val="CommentTok"/>
           <w:rFonts w:ascii="Consolas" w:hAnsi="Consolas"/>
           <w:sz w:val="20"/>
+          <w:shd w:fill="F5F5F5"/>
         </w:rPr>
         <w:t xml:space="preserve"># Test the function</w:t>
       </w:r>
@@ -3867,14 +4186,16 @@
         <w:rPr>
           <w:rFonts w:ascii="Consolas" w:hAnsi="Consolas"/>
           <w:sz w:val="20"/>
-        </w:rPr>
-        <w:br/>
-      </w:r>
-      <w:r>
-        <w:rPr>
-          <w:rStyle w:val="NormalTok"/>
-          <w:rFonts w:ascii="Consolas" w:hAnsi="Consolas"/>
-          <w:sz w:val="20"/>
+          <w:shd w:fill="F5F5F5"/>
+        </w:rPr>
+        <w:br/>
+      </w:r>
+      <w:r>
+        <w:rPr>
+          <w:rStyle w:val="NormalTok"/>
+          <w:rFonts w:ascii="Consolas" w:hAnsi="Consolas"/>
+          <w:sz w:val="20"/>
+          <w:shd w:fill="F5F5F5"/>
         </w:rPr>
         <w:t xml:space="preserve">divide_with_handling()</w:t>
       </w:r>
@@ -3897,7 +4218,8 @@
     <w:p>
       <w:pPr>
         <w:pStyle w:val="SourceCode"/>
-        <w:spacing w:line="480" w:lineRule="auto"/>
+        <w:spacing w:line="240" w:lineRule="auto"/>
+        <w:ind w:left="720"/>
       </w:pPr>
       <w:r>
         <w:rPr>
@@ -3960,75 +4282,75 @@
       </w:pPr>
       <w:r>
         <w:rPr>
-          <w:rFonts w:ascii="Consolas" w:hAnsi="Consolas"/>
+          <w:rFonts w:ascii="Times New Roman" w:hAnsi="Times New Roman"/>
           <w:b/>
           <w:bCs/>
-          <w:sz w:val="20"/>
+          <w:sz w:val="24"/>
         </w:rPr>
         <w:t xml:space="preserve">Explanation</w:t>
       </w:r>
       <w:r>
         <w:rPr>
-          <w:rFonts w:ascii="Consolas" w:hAnsi="Consolas"/>
-          <w:sz w:val="20"/>
+          <w:rFonts w:ascii="Times New Roman" w:hAnsi="Times New Roman"/>
+          <w:sz w:val="24"/>
         </w:rPr>
         <w:t xml:space="preserve">: The try block contains the potentially dangerous code. When the user enters 0 as the denominator, the condition</w:t>
       </w:r>
       <w:r>
         <w:rPr>
-          <w:rFonts w:ascii="Consolas" w:hAnsi="Consolas"/>
-          <w:sz w:val="20"/>
+          <w:rFonts w:ascii="Times New Roman" w:hAnsi="Times New Roman"/>
+          <w:sz w:val="24"/>
         </w:rPr>
         <w:t xml:space="preserve"> </w:t>
       </w:r>
       <w:r>
         <w:rPr>
           <w:rStyle w:val="VerbatimChar"/>
-          <w:rFonts w:ascii="Consolas" w:hAnsi="Consolas"/>
-          <w:sz w:val="20"/>
+          <w:rFonts w:ascii="Times New Roman" w:hAnsi="Times New Roman"/>
+          <w:sz w:val="24"/>
         </w:rPr>
         <w:t xml:space="preserve">num2 == 0</w:t>
       </w:r>
       <w:r>
         <w:rPr>
-          <w:rFonts w:ascii="Consolas" w:hAnsi="Consolas"/>
-          <w:sz w:val="20"/>
+          <w:rFonts w:ascii="Times New Roman" w:hAnsi="Times New Roman"/>
+          <w:sz w:val="24"/>
         </w:rPr>
         <w:t xml:space="preserve"> </w:t>
       </w:r>
       <w:r>
         <w:rPr>
-          <w:rFonts w:ascii="Consolas" w:hAnsi="Consolas"/>
-          <w:sz w:val="20"/>
+          <w:rFonts w:ascii="Times New Roman" w:hAnsi="Times New Roman"/>
+          <w:sz w:val="24"/>
         </w:rPr>
         <w:t xml:space="preserve">evaluates to true, and the program explicitly raises a</w:t>
       </w:r>
       <w:r>
         <w:rPr>
-          <w:rFonts w:ascii="Consolas" w:hAnsi="Consolas"/>
-          <w:sz w:val="20"/>
+          <w:rFonts w:ascii="Times New Roman" w:hAnsi="Times New Roman"/>
+          <w:sz w:val="24"/>
         </w:rPr>
         <w:t xml:space="preserve"> </w:t>
       </w:r>
       <w:r>
         <w:rPr>
           <w:rStyle w:val="VerbatimChar"/>
-          <w:rFonts w:ascii="Consolas" w:hAnsi="Consolas"/>
-          <w:sz w:val="20"/>
+          <w:rFonts w:ascii="Times New Roman" w:hAnsi="Times New Roman"/>
+          <w:sz w:val="24"/>
         </w:rPr>
         <w:t xml:space="preserve">ZeroDivisionError</w:t>
       </w:r>
       <w:r>
         <w:rPr>
-          <w:rFonts w:ascii="Consolas" w:hAnsi="Consolas"/>
-          <w:sz w:val="20"/>
+          <w:rFonts w:ascii="Times New Roman" w:hAnsi="Times New Roman"/>
+          <w:sz w:val="24"/>
         </w:rPr>
         <w:t xml:space="preserve"> </w:t>
       </w:r>
       <w:r>
         <w:rPr>
-          <w:rFonts w:ascii="Consolas" w:hAnsi="Consolas"/>
-          <w:sz w:val="20"/>
+          <w:rFonts w:ascii="Times New Roman" w:hAnsi="Times New Roman"/>
+          <w:sz w:val="24"/>
         </w:rPr>
         <w:t xml:space="preserve">with a custom message. The except block catches this exception and prints the user-friendly error message, allowing the program to terminate gracefully without a crash.</w:t>
       </w:r>
@@ -4051,7 +4373,8 @@
     <w:p>
       <w:pPr>
         <w:pStyle w:val="SourceCode"/>
-        <w:spacing w:line="480" w:lineRule="auto"/>
+        <w:spacing w:line="240" w:lineRule="auto"/>
+        <w:ind w:left="720"/>
       </w:pPr>
       <w:r>
         <w:rPr>
@@ -4147,7 +4470,8 @@
     <w:p>
       <w:pPr>
         <w:pStyle w:val="SourceCode"/>
-        <w:spacing w:line="480" w:lineRule="auto"/>
+        <w:spacing w:line="240" w:lineRule="auto"/>
+        <w:ind w:left="720"/>
       </w:pPr>
       <w:r>
         <w:rPr>

</xml_diff>